<commit_message>
Fix Task 1 USDZ Quick Look and handle iOS fallback for Task 4 WebXR
</commit_message>
<xml_diff>
--- a/1-2_МамасоваАС_ИКБО-30_24.docx
+++ b/1-2_МамасоваАС_ИКБО-30_24.docx
@@ -275,7 +275,7 @@
                 </mc:Choice>
                 <mc:Fallback>
                   <w:pict>
-                    <v:line w14:anchorId="7510F1CE" id="Прямая соединительная линия 6" o:spid="_x0000_s1026" style="flip:y;visibility:visible;mso-wrap-style:square;mso-left-percent:-10001;mso-top-percent:-10001;mso-position-horizontal:absolute;mso-position-horizontal-relative:char;mso-position-vertical:absolute;mso-position-vertical-relative:line;mso-left-percent:-10001;mso-top-percent:-10001" from="0,0" to="441pt,.1pt" o:gfxdata="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" strokeweight="3pt">
+                    <v:line w14:anchorId="29D3C1B2" id="Прямая соединительная линия 6" o:spid="_x0000_s1026" style="flip:y;visibility:visible;mso-wrap-style:square;mso-left-percent:-10001;mso-top-percent:-10001;mso-position-horizontal:absolute;mso-position-horizontal-relative:char;mso-position-vertical:absolute;mso-position-vertical-relative:line;mso-left-percent:-10001;mso-top-percent:-10001" from="0,0" to="441pt,.1pt" o:gfxdata="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" strokeweight="3pt">
                       <v:stroke linestyle="thinThin"/>
                       <w10:anchorlock/>
                     </v:line>
@@ -415,7 +415,16 @@
           <w:sz w:val="32"/>
           <w:lang w:val="ru-RU"/>
         </w:rPr>
-        <w:t>ОТЧЕТ ПО ЗАДАНИЯМ № 1-4</w:t>
+        <w:t>ОТЧЕТ ПО ЗАДАНИЯМ № 1-</w:t>
+      </w:r>
+      <w:r>
+        <w:rPr>
+          <w:rFonts w:eastAsia="MS Mincho" w:cs="Times New Roman"/>
+          <w:b/>
+          <w:sz w:val="32"/>
+          <w:lang w:val="ru-RU"/>
+        </w:rPr>
+        <w:t>2</w:t>
       </w:r>
       <w:r>
         <w:rPr>
@@ -527,7 +536,7 @@
           </w:tcPr>
           <w:p>
             <w:pPr>
-              <w:spacing w:after="0" w:line="240" w:lineRule="auto"/>
+              <w:spacing w:after="0"/>
               <w:rPr>
                 <w:rFonts w:eastAsia="Calibri"/>
                 <w:color w:val="auto"/>
@@ -556,7 +565,7 @@
           </w:p>
           <w:p>
             <w:pPr>
-              <w:spacing w:after="0" w:line="240" w:lineRule="auto"/>
+              <w:spacing w:after="0"/>
               <w:rPr>
                 <w:rFonts w:eastAsia="Calibri"/>
                 <w:color w:val="auto"/>
@@ -573,7 +582,7 @@
           </w:tcPr>
           <w:p>
             <w:pPr>
-              <w:spacing w:after="0" w:line="240" w:lineRule="auto"/>
+              <w:spacing w:after="0"/>
               <w:rPr>
                 <w:rFonts w:eastAsia="Calibri"/>
                 <w:i/>
@@ -629,7 +638,7 @@
           </w:tcPr>
           <w:p>
             <w:pPr>
-              <w:spacing w:after="0" w:line="240" w:lineRule="auto"/>
+              <w:spacing w:after="0"/>
               <w:rPr>
                 <w:color w:val="auto"/>
                 <w:szCs w:val="24"/>
@@ -648,7 +657,7 @@
           </w:p>
           <w:p>
             <w:pPr>
-              <w:spacing w:after="0" w:line="240" w:lineRule="auto"/>
+              <w:spacing w:after="0"/>
               <w:rPr>
                 <w:rFonts w:eastAsia="Calibri"/>
                 <w:color w:val="auto"/>
@@ -664,7 +673,7 @@
           </w:tcPr>
           <w:p>
             <w:pPr>
-              <w:spacing w:after="0" w:line="240" w:lineRule="auto"/>
+              <w:spacing w:after="0"/>
               <w:rPr>
                 <w:rFonts w:ascii="Calibri" w:eastAsia="Calibri" w:hAnsi="Calibri"/>
                 <w:i/>
@@ -701,7 +710,7 @@
           </w:p>
           <w:p>
             <w:pPr>
-              <w:spacing w:after="0" w:line="240" w:lineRule="auto"/>
+              <w:spacing w:after="0"/>
               <w:rPr>
                 <w:rFonts w:ascii="Calibri" w:eastAsia="Calibri" w:hAnsi="Calibri"/>
                 <w:i/>
@@ -714,7 +723,7 @@
           </w:p>
           <w:p>
             <w:pPr>
-              <w:spacing w:after="0" w:line="240" w:lineRule="auto"/>
+              <w:spacing w:after="0"/>
               <w:rPr>
                 <w:rFonts w:eastAsia="Calibri"/>
                 <w:color w:val="auto"/>
@@ -736,7 +745,7 @@
           </w:tcPr>
           <w:p>
             <w:pPr>
-              <w:spacing w:after="0" w:line="240" w:lineRule="auto"/>
+              <w:spacing w:after="0"/>
               <w:rPr>
                 <w:rFonts w:eastAsia="Calibri"/>
                 <w:color w:val="auto"/>
@@ -3175,2520 +3184,6 @@
         </w:drawing>
       </w:r>
     </w:p>
-    <w:p>
-      <w:pPr>
-        <w:spacing w:before="240"/>
-        <w:jc w:val="center"/>
-        <w:rPr>
-          <w:lang w:val="ru-RU"/>
-        </w:rPr>
-      </w:pPr>
-      <w:r>
-        <w:rPr>
-          <w:b/>
-          <w:sz w:val="28"/>
-          <w:lang w:val="ru-RU"/>
-        </w:rPr>
-        <w:lastRenderedPageBreak/>
-        <w:t>ЗАДАНИЕ 3</w:t>
-      </w:r>
-    </w:p>
-    <w:p>
-      <w:pPr>
-        <w:jc w:val="center"/>
-        <w:rPr>
-          <w:lang w:val="ru-RU"/>
-        </w:rPr>
-      </w:pPr>
-      <w:r>
-        <w:rPr>
-          <w:b/>
-          <w:lang w:val="ru-RU"/>
-        </w:rPr>
-        <w:t xml:space="preserve">Тема: </w:t>
-      </w:r>
-      <w:r>
-        <w:rPr>
-          <w:b/>
-        </w:rPr>
-        <w:t>AR</w:t>
-      </w:r>
-      <w:r>
-        <w:rPr>
-          <w:b/>
-          <w:lang w:val="ru-RU"/>
-        </w:rPr>
-        <w:t xml:space="preserve">-маска или эффект с использованием </w:t>
-      </w:r>
-      <w:proofErr w:type="spellStart"/>
-      <w:r>
-        <w:rPr>
-          <w:b/>
-        </w:rPr>
-        <w:t>MindAR</w:t>
-      </w:r>
-      <w:proofErr w:type="spellEnd"/>
-      <w:r>
-        <w:rPr>
-          <w:b/>
-          <w:lang w:val="ru-RU"/>
-        </w:rPr>
-        <w:t xml:space="preserve"> </w:t>
-      </w:r>
-      <w:r>
-        <w:rPr>
-          <w:b/>
-        </w:rPr>
-        <w:t>Face</w:t>
-      </w:r>
-      <w:r>
-        <w:rPr>
-          <w:b/>
-          <w:lang w:val="ru-RU"/>
-        </w:rPr>
-        <w:t xml:space="preserve"> </w:t>
-      </w:r>
-      <w:r>
-        <w:rPr>
-          <w:b/>
-        </w:rPr>
-        <w:t>Tracking</w:t>
-      </w:r>
-    </w:p>
-    <w:p>
-      <w:pPr>
-        <w:spacing w:before="240"/>
-      </w:pPr>
-      <w:proofErr w:type="spellStart"/>
-      <w:r>
-        <w:rPr>
-          <w:b/>
-        </w:rPr>
-        <w:t>Требования</w:t>
-      </w:r>
-      <w:proofErr w:type="spellEnd"/>
-      <w:r>
-        <w:rPr>
-          <w:b/>
-        </w:rPr>
-        <w:t>:</w:t>
-      </w:r>
-    </w:p>
-    <w:p>
-      <w:pPr>
-        <w:pStyle w:val="a0"/>
-      </w:pPr>
-      <w:r>
-        <w:t>Создание WebAR-сцены.</w:t>
-      </w:r>
-    </w:p>
-    <w:p>
-      <w:pPr>
-        <w:pStyle w:val="a0"/>
-      </w:pPr>
-      <w:r>
-        <w:t>Использование MindAR Face Tracking.</w:t>
-      </w:r>
-    </w:p>
-    <w:p>
-      <w:pPr>
-        <w:pStyle w:val="a0"/>
-        <w:rPr>
-          <w:lang w:val="ru-RU"/>
-        </w:rPr>
-      </w:pPr>
-      <w:r>
-        <w:rPr>
-          <w:lang w:val="ru-RU"/>
-        </w:rPr>
-        <w:t>Накладывание 3</w:t>
-      </w:r>
-      <w:r>
-        <w:t>D</w:t>
-      </w:r>
-      <w:r>
-        <w:rPr>
-          <w:lang w:val="ru-RU"/>
-        </w:rPr>
-        <w:t>-маски или фильтра (очки, шляпа, анимированная рамка) при обнаружении лица.</w:t>
-      </w:r>
-    </w:p>
-    <w:p>
-      <w:pPr>
-        <w:pStyle w:val="a0"/>
-        <w:rPr>
-          <w:lang w:val="ru-RU"/>
-        </w:rPr>
-      </w:pPr>
-      <w:r>
-        <w:rPr>
-          <w:lang w:val="ru-RU"/>
-        </w:rPr>
-        <w:t>Настройка масштаба, позиции, привязки к ключевым точкам лица.</w:t>
-      </w:r>
-    </w:p>
-    <w:p>
-      <w:pPr>
-        <w:pStyle w:val="a0"/>
-        <w:rPr>
-          <w:lang w:val="ru-RU"/>
-        </w:rPr>
-      </w:pPr>
-      <w:r>
-        <w:rPr>
-          <w:lang w:val="ru-RU"/>
-        </w:rPr>
-        <w:t>Обеспечение стабильности трекинга при движении головы.</w:t>
-      </w:r>
-    </w:p>
-    <w:p>
-      <w:pPr>
-        <w:spacing w:before="240"/>
-        <w:rPr>
-          <w:lang w:val="ru-RU"/>
-        </w:rPr>
-      </w:pPr>
-      <w:r>
-        <w:rPr>
-          <w:b/>
-          <w:lang w:val="ru-RU"/>
-        </w:rPr>
-        <w:t>Описание выполнения работы:</w:t>
-      </w:r>
-    </w:p>
-    <w:p>
-      <w:pPr>
-        <w:rPr>
-          <w:lang w:val="ru-RU"/>
-        </w:rPr>
-      </w:pPr>
-      <w:r>
-        <w:rPr>
-          <w:b/>
-          <w:lang w:val="ru-RU"/>
-        </w:rPr>
-        <w:t>Подготовка 3</w:t>
-      </w:r>
-      <w:r>
-        <w:rPr>
-          <w:b/>
-        </w:rPr>
-        <w:t>D</w:t>
-      </w:r>
-      <w:r>
-        <w:rPr>
-          <w:b/>
-          <w:lang w:val="ru-RU"/>
-        </w:rPr>
-        <w:t xml:space="preserve">-модели. </w:t>
-      </w:r>
-      <w:r>
-        <w:rPr>
-          <w:lang w:val="ru-RU"/>
-        </w:rPr>
-        <w:t>Для ресторанной тематики была подготовлена 3</w:t>
-      </w:r>
-      <w:r>
-        <w:t>D</w:t>
-      </w:r>
-      <w:r>
-        <w:rPr>
-          <w:lang w:val="ru-RU"/>
-        </w:rPr>
-        <w:t>-модель белого колпака шеф-повара (</w:t>
-      </w:r>
-      <w:r>
-        <w:t>chef</w:t>
-      </w:r>
-      <w:r>
-        <w:rPr>
-          <w:lang w:val="ru-RU"/>
-        </w:rPr>
-        <w:t>_</w:t>
-      </w:r>
-      <w:r>
-        <w:t>hat</w:t>
-      </w:r>
-      <w:r>
-        <w:rPr>
-          <w:lang w:val="ru-RU"/>
-        </w:rPr>
-        <w:t>.</w:t>
-      </w:r>
-      <w:proofErr w:type="spellStart"/>
-      <w:r>
-        <w:t>glb</w:t>
-      </w:r>
-      <w:proofErr w:type="spellEnd"/>
-      <w:r>
-        <w:rPr>
-          <w:lang w:val="ru-RU"/>
-        </w:rPr>
-        <w:t xml:space="preserve">) в формате </w:t>
-      </w:r>
-      <w:proofErr w:type="spellStart"/>
-      <w:r>
-        <w:t>glTF</w:t>
-      </w:r>
-      <w:proofErr w:type="spellEnd"/>
-      <w:r>
-        <w:rPr>
-          <w:lang w:val="ru-RU"/>
-        </w:rPr>
-        <w:t>.</w:t>
-      </w:r>
-    </w:p>
-    <w:p>
-      <w:r>
-        <w:rPr>
-          <w:b/>
-          <w:lang w:val="ru-RU"/>
-        </w:rPr>
-        <w:t xml:space="preserve">Разработка </w:t>
-      </w:r>
-      <w:r>
-        <w:rPr>
-          <w:b/>
-        </w:rPr>
-        <w:t>HTML</w:t>
-      </w:r>
-      <w:r>
-        <w:rPr>
-          <w:b/>
-          <w:lang w:val="ru-RU"/>
-        </w:rPr>
-        <w:t xml:space="preserve">-сцены и привязка к лицу. </w:t>
-      </w:r>
-      <w:r>
-        <w:rPr>
-          <w:lang w:val="ru-RU"/>
-        </w:rPr>
-        <w:t xml:space="preserve">Создана страница с подключением </w:t>
-      </w:r>
-      <w:proofErr w:type="spellStart"/>
-      <w:r>
-        <w:t>mindar</w:t>
-      </w:r>
-      <w:proofErr w:type="spellEnd"/>
-      <w:r>
-        <w:rPr>
-          <w:lang w:val="ru-RU"/>
-        </w:rPr>
-        <w:t>-</w:t>
-      </w:r>
-      <w:r>
-        <w:t>face</w:t>
-      </w:r>
-      <w:r>
-        <w:rPr>
-          <w:lang w:val="ru-RU"/>
-        </w:rPr>
-        <w:t>-</w:t>
-      </w:r>
-      <w:proofErr w:type="spellStart"/>
-      <w:r>
-        <w:t>aframe</w:t>
-      </w:r>
-      <w:proofErr w:type="spellEnd"/>
-      <w:r>
-        <w:rPr>
-          <w:lang w:val="ru-RU"/>
-        </w:rPr>
-        <w:t>.</w:t>
-      </w:r>
-      <w:r>
-        <w:t>prod</w:t>
-      </w:r>
-      <w:r>
-        <w:rPr>
-          <w:lang w:val="ru-RU"/>
-        </w:rPr>
-        <w:t>.</w:t>
-      </w:r>
-      <w:proofErr w:type="spellStart"/>
-      <w:r>
-        <w:t>js</w:t>
-      </w:r>
-      <w:proofErr w:type="spellEnd"/>
-      <w:r>
-        <w:rPr>
-          <w:lang w:val="ru-RU"/>
-        </w:rPr>
-        <w:t>. В теге &lt;</w:t>
-      </w:r>
-      <w:r>
-        <w:t>a</w:t>
-      </w:r>
-      <w:r>
-        <w:rPr>
-          <w:lang w:val="ru-RU"/>
-        </w:rPr>
-        <w:t>-</w:t>
-      </w:r>
-      <w:r>
-        <w:t>scene</w:t>
-      </w:r>
-      <w:r>
-        <w:rPr>
-          <w:lang w:val="ru-RU"/>
-        </w:rPr>
-        <w:t xml:space="preserve">&gt; включен модуль </w:t>
-      </w:r>
-      <w:proofErr w:type="spellStart"/>
-      <w:r>
-        <w:t>mindar</w:t>
-      </w:r>
-      <w:proofErr w:type="spellEnd"/>
-      <w:r>
-        <w:rPr>
-          <w:lang w:val="ru-RU"/>
-        </w:rPr>
-        <w:t>-</w:t>
-      </w:r>
-      <w:r>
-        <w:t>face</w:t>
-      </w:r>
-      <w:r>
-        <w:rPr>
-          <w:lang w:val="ru-RU"/>
-        </w:rPr>
-        <w:t xml:space="preserve"> на базе нейросети </w:t>
-      </w:r>
-      <w:proofErr w:type="spellStart"/>
-      <w:r>
-        <w:t>MediaPipe</w:t>
-      </w:r>
-      <w:proofErr w:type="spellEnd"/>
-      <w:r>
-        <w:rPr>
-          <w:lang w:val="ru-RU"/>
-        </w:rPr>
-        <w:t xml:space="preserve"> </w:t>
-      </w:r>
-      <w:proofErr w:type="spellStart"/>
-      <w:r>
-        <w:t>FaceMesh</w:t>
-      </w:r>
-      <w:proofErr w:type="spellEnd"/>
-      <w:r>
-        <w:rPr>
-          <w:lang w:val="ru-RU"/>
-        </w:rPr>
-        <w:t xml:space="preserve">. </w:t>
-      </w:r>
-      <w:proofErr w:type="gramStart"/>
-      <w:r>
-        <w:rPr>
-          <w:lang w:val="ru-RU"/>
-        </w:rPr>
-        <w:t>В сущности</w:t>
-      </w:r>
-      <w:proofErr w:type="gramEnd"/>
-      <w:r>
-        <w:rPr>
-          <w:lang w:val="ru-RU"/>
-        </w:rPr>
-        <w:t xml:space="preserve"> &lt;</w:t>
-      </w:r>
-      <w:r>
-        <w:t>a</w:t>
-      </w:r>
-      <w:r>
-        <w:rPr>
-          <w:lang w:val="ru-RU"/>
-        </w:rPr>
-        <w:t>-</w:t>
-      </w:r>
-      <w:r>
-        <w:t>entity</w:t>
-      </w:r>
-      <w:r>
-        <w:rPr>
-          <w:lang w:val="ru-RU"/>
-        </w:rPr>
-        <w:t xml:space="preserve"> </w:t>
-      </w:r>
-      <w:proofErr w:type="spellStart"/>
-      <w:r>
-        <w:t>mindar</w:t>
-      </w:r>
-      <w:proofErr w:type="spellEnd"/>
-      <w:r>
-        <w:rPr>
-          <w:lang w:val="ru-RU"/>
-        </w:rPr>
-        <w:t>-</w:t>
-      </w:r>
-      <w:r>
-        <w:t>face</w:t>
-      </w:r>
-      <w:r>
-        <w:rPr>
-          <w:lang w:val="ru-RU"/>
-        </w:rPr>
-        <w:t>-</w:t>
-      </w:r>
-      <w:r>
-        <w:t>target</w:t>
-      </w:r>
-      <w:r>
-        <w:rPr>
-          <w:lang w:val="ru-RU"/>
-        </w:rPr>
-        <w:t>="</w:t>
-      </w:r>
-      <w:proofErr w:type="spellStart"/>
-      <w:r>
-        <w:t>anchorIndex</w:t>
-      </w:r>
-      <w:proofErr w:type="spellEnd"/>
-      <w:r>
-        <w:rPr>
-          <w:lang w:val="ru-RU"/>
-        </w:rPr>
-        <w:t xml:space="preserve">: 10"&gt; настроена привязка колпака к верхней части лба (точка 10). </w:t>
-      </w:r>
-      <w:r>
-        <w:t xml:space="preserve">Подобраны </w:t>
-      </w:r>
-      <w:proofErr w:type="spellStart"/>
-      <w:r>
-        <w:t>масштаб</w:t>
-      </w:r>
-      <w:proofErr w:type="spellEnd"/>
-      <w:r>
-        <w:t xml:space="preserve"> и </w:t>
-      </w:r>
-      <w:proofErr w:type="spellStart"/>
-      <w:r>
-        <w:t>положение</w:t>
-      </w:r>
-      <w:proofErr w:type="spellEnd"/>
-      <w:r>
-        <w:t>.</w:t>
-      </w:r>
-    </w:p>
-    <w:p>
-      <w:pPr>
-        <w:spacing w:before="240"/>
-      </w:pPr>
-      <w:r>
-        <w:rPr>
-          <w:b/>
-        </w:rPr>
-        <w:t>Листинг кода index.html:</w:t>
-      </w:r>
-    </w:p>
-    <w:tbl>
-      <w:tblPr>
-        <w:tblW w:w="0" w:type="auto"/>
-        <w:jc w:val="center"/>
-        <w:tblLook w:val="04A0" w:firstRow="1" w:lastRow="0" w:firstColumn="1" w:lastColumn="0" w:noHBand="0" w:noVBand="1"/>
-      </w:tblPr>
-      <w:tblGrid>
-        <w:gridCol w:w="9360"/>
-      </w:tblGrid>
-      <w:tr>
-        <w:trPr>
-          <w:jc w:val="center"/>
-        </w:trPr>
-        <w:tc>
-          <w:tcPr>
-            <w:tcW w:w="9360" w:type="dxa"/>
-            <w:tcBorders>
-              <w:top w:val="single" w:sz="4" w:space="0" w:color="94A3B8"/>
-              <w:left w:val="single" w:sz="4" w:space="0" w:color="94A3B8"/>
-              <w:bottom w:val="single" w:sz="4" w:space="0" w:color="94A3B8"/>
-              <w:right w:val="single" w:sz="4" w:space="0" w:color="94A3B8"/>
-            </w:tcBorders>
-            <w:shd w:val="clear" w:color="auto" w:fill="F8FAFC"/>
-          </w:tcPr>
-          <w:p>
-            <w:pPr>
-              <w:spacing w:after="0" w:line="240" w:lineRule="auto"/>
-            </w:pPr>
-            <w:r>
-              <w:rPr>
-                <w:rFonts w:ascii="Consolas" w:hAnsi="Consolas"/>
-                <w:color w:val="1E293B"/>
-                <w:sz w:val="17"/>
-              </w:rPr>
-              <w:t>&lt;!DOCTYPE html&gt;</w:t>
-            </w:r>
-            <w:r>
-              <w:rPr>
-                <w:rFonts w:ascii="Consolas" w:hAnsi="Consolas"/>
-                <w:color w:val="1E293B"/>
-                <w:sz w:val="17"/>
-              </w:rPr>
-              <w:br/>
-              <w:t>&lt;html lang="ru"&gt;</w:t>
-            </w:r>
-            <w:r>
-              <w:rPr>
-                <w:rFonts w:ascii="Consolas" w:hAnsi="Consolas"/>
-                <w:color w:val="1E293B"/>
-                <w:sz w:val="17"/>
-              </w:rPr>
-              <w:br/>
-              <w:t>&lt;head&gt;</w:t>
-            </w:r>
-            <w:r>
-              <w:rPr>
-                <w:rFonts w:ascii="Consolas" w:hAnsi="Consolas"/>
-                <w:color w:val="1E293B"/>
-                <w:sz w:val="17"/>
-              </w:rPr>
-              <w:br/>
-              <w:t xml:space="preserve">    &lt;meta charset="UTF-8"&gt;</w:t>
-            </w:r>
-            <w:r>
-              <w:rPr>
-                <w:rFonts w:ascii="Consolas" w:hAnsi="Consolas"/>
-                <w:color w:val="1E293B"/>
-                <w:sz w:val="17"/>
-              </w:rPr>
-              <w:br/>
-              <w:t xml:space="preserve">    &lt;meta name="viewport" content="width=device-width, initial-scale=1.0"&gt;</w:t>
-            </w:r>
-            <w:r>
-              <w:rPr>
-                <w:rFonts w:ascii="Consolas" w:hAnsi="Consolas"/>
-                <w:color w:val="1E293B"/>
-                <w:sz w:val="17"/>
-              </w:rPr>
-              <w:br/>
-              <w:t xml:space="preserve">    &lt;title&gt;WebAR Задание 3 - Колпак шеф-повара&lt;/title&gt;</w:t>
-            </w:r>
-            <w:r>
-              <w:rPr>
-                <w:rFonts w:ascii="Consolas" w:hAnsi="Consolas"/>
-                <w:color w:val="1E293B"/>
-                <w:sz w:val="17"/>
-              </w:rPr>
-              <w:br/>
-              <w:t xml:space="preserve">    &lt;!-- Подключаем A-Frame и MindAR Face Tracking --&gt;</w:t>
-            </w:r>
-            <w:r>
-              <w:rPr>
-                <w:rFonts w:ascii="Consolas" w:hAnsi="Consolas"/>
-                <w:color w:val="1E293B"/>
-                <w:sz w:val="17"/>
-              </w:rPr>
-              <w:br/>
-              <w:t xml:space="preserve">    &lt;script src="https://aframe.io/releases/1.4.2/aframe.min.js"&gt;&lt;/script&gt;</w:t>
-            </w:r>
-            <w:r>
-              <w:rPr>
-                <w:rFonts w:ascii="Consolas" w:hAnsi="Consolas"/>
-                <w:color w:val="1E293B"/>
-                <w:sz w:val="17"/>
-              </w:rPr>
-              <w:br/>
-              <w:t xml:space="preserve">    &lt;script src="https://cdn.jsdelivr.net/npm/mind-ar@1.2.5/dist/mindar-face-aframe.prod.js"&gt;&lt;/script&gt;</w:t>
-            </w:r>
-            <w:r>
-              <w:rPr>
-                <w:rFonts w:ascii="Consolas" w:hAnsi="Consolas"/>
-                <w:color w:val="1E293B"/>
-                <w:sz w:val="17"/>
-              </w:rPr>
-              <w:br/>
-              <w:t xml:space="preserve">    &lt;style&gt;</w:t>
-            </w:r>
-            <w:r>
-              <w:rPr>
-                <w:rFonts w:ascii="Consolas" w:hAnsi="Consolas"/>
-                <w:color w:val="1E293B"/>
-                <w:sz w:val="17"/>
-              </w:rPr>
-              <w:br/>
-              <w:t xml:space="preserve">        body { margin: 0; overflow: hidden; }</w:t>
-            </w:r>
-            <w:r>
-              <w:rPr>
-                <w:rFonts w:ascii="Consolas" w:hAnsi="Consolas"/>
-                <w:color w:val="1E293B"/>
-                <w:sz w:val="17"/>
-              </w:rPr>
-              <w:br/>
-              <w:t xml:space="preserve">    &lt;/style&gt;</w:t>
-            </w:r>
-            <w:r>
-              <w:rPr>
-                <w:rFonts w:ascii="Consolas" w:hAnsi="Consolas"/>
-                <w:color w:val="1E293B"/>
-                <w:sz w:val="17"/>
-              </w:rPr>
-              <w:br/>
-              <w:t>&lt;/head&gt;</w:t>
-            </w:r>
-            <w:r>
-              <w:rPr>
-                <w:rFonts w:ascii="Consolas" w:hAnsi="Consolas"/>
-                <w:color w:val="1E293B"/>
-                <w:sz w:val="17"/>
-              </w:rPr>
-              <w:br/>
-              <w:t>&lt;body&gt;</w:t>
-            </w:r>
-            <w:r>
-              <w:rPr>
-                <w:rFonts w:ascii="Consolas" w:hAnsi="Consolas"/>
-                <w:color w:val="1E293B"/>
-                <w:sz w:val="17"/>
-              </w:rPr>
-              <w:br/>
-              <w:t xml:space="preserve">    &lt;!-- Инициализация AR-сцены с Face Tracking --&gt;</w:t>
-            </w:r>
-            <w:r>
-              <w:rPr>
-                <w:rFonts w:ascii="Consolas" w:hAnsi="Consolas"/>
-                <w:color w:val="1E293B"/>
-                <w:sz w:val="17"/>
-              </w:rPr>
-              <w:br/>
-              <w:t xml:space="preserve">    &lt;a-scene mindar-face vr-mode-ui="enabled: false" device-orientation-permission-ui="enabled: false"&gt;</w:t>
-            </w:r>
-            <w:r>
-              <w:rPr>
-                <w:rFonts w:ascii="Consolas" w:hAnsi="Consolas"/>
-                <w:color w:val="1E293B"/>
-                <w:sz w:val="17"/>
-              </w:rPr>
-              <w:br/>
-              <w:t xml:space="preserve">        &lt;a-assets&gt;</w:t>
-            </w:r>
-            <w:r>
-              <w:rPr>
-                <w:rFonts w:ascii="Consolas" w:hAnsi="Consolas"/>
-                <w:color w:val="1E293B"/>
-                <w:sz w:val="17"/>
-              </w:rPr>
-              <w:br/>
-              <w:t xml:space="preserve">            &lt;a-asset-item id="hatModel" src="./chef_hat.glb"&gt;&lt;/a-asset-item&gt;</w:t>
-            </w:r>
-            <w:r>
-              <w:rPr>
-                <w:rFonts w:ascii="Consolas" w:hAnsi="Consolas"/>
-                <w:color w:val="1E293B"/>
-                <w:sz w:val="17"/>
-              </w:rPr>
-              <w:br/>
-              <w:t xml:space="preserve">        &lt;/a-assets&gt;</w:t>
-            </w:r>
-            <w:r>
-              <w:rPr>
-                <w:rFonts w:ascii="Consolas" w:hAnsi="Consolas"/>
-                <w:color w:val="1E293B"/>
-                <w:sz w:val="17"/>
-              </w:rPr>
-              <w:br/>
-            </w:r>
-            <w:r>
-              <w:rPr>
-                <w:rFonts w:ascii="Consolas" w:hAnsi="Consolas"/>
-                <w:color w:val="1E293B"/>
-                <w:sz w:val="17"/>
-              </w:rPr>
-              <w:br/>
-              <w:t xml:space="preserve">        &lt;a-camera active="false" position="0 0 0"&gt;&lt;/a-camera&gt;</w:t>
-            </w:r>
-            <w:r>
-              <w:rPr>
-                <w:rFonts w:ascii="Consolas" w:hAnsi="Consolas"/>
-                <w:color w:val="1E293B"/>
-                <w:sz w:val="17"/>
-              </w:rPr>
-              <w:br/>
-            </w:r>
-            <w:r>
-              <w:rPr>
-                <w:rFonts w:ascii="Consolas" w:hAnsi="Consolas"/>
-                <w:color w:val="1E293B"/>
-                <w:sz w:val="17"/>
-              </w:rPr>
-              <w:br/>
-              <w:t xml:space="preserve">        &lt;!-- Освещение сцены --&gt;</w:t>
-            </w:r>
-            <w:r>
-              <w:rPr>
-                <w:rFonts w:ascii="Consolas" w:hAnsi="Consolas"/>
-                <w:color w:val="1E293B"/>
-                <w:sz w:val="17"/>
-              </w:rPr>
-              <w:br/>
-              <w:t xml:space="preserve">        &lt;a-light type="ambient" color="#FFFFFF" intensity="0.9"&gt;&lt;/a-light&gt;</w:t>
-            </w:r>
-            <w:r>
-              <w:rPr>
-                <w:rFonts w:ascii="Consolas" w:hAnsi="Consolas"/>
-                <w:color w:val="1E293B"/>
-                <w:sz w:val="17"/>
-              </w:rPr>
-              <w:br/>
-              <w:t xml:space="preserve">        &lt;a-light type="directional" position="0 2 1" intensity="1.2"&gt;&lt;/a-light&gt;</w:t>
-            </w:r>
-            <w:r>
-              <w:rPr>
-                <w:rFonts w:ascii="Consolas" w:hAnsi="Consolas"/>
-                <w:color w:val="1E293B"/>
-                <w:sz w:val="17"/>
-              </w:rPr>
-              <w:br/>
-            </w:r>
-            <w:r>
-              <w:rPr>
-                <w:rFonts w:ascii="Consolas" w:hAnsi="Consolas"/>
-                <w:color w:val="1E293B"/>
-                <w:sz w:val="17"/>
-              </w:rPr>
-              <w:br/>
-              <w:t xml:space="preserve">        &lt;!-- Точка 10 — верх лба / макушка головы для головных уборов --&gt;</w:t>
-            </w:r>
-            <w:r>
-              <w:rPr>
-                <w:rFonts w:ascii="Consolas" w:hAnsi="Consolas"/>
-                <w:color w:val="1E293B"/>
-                <w:sz w:val="17"/>
-              </w:rPr>
-              <w:br/>
-              <w:t xml:space="preserve">        &lt;a-entity mindar-face-target="anchorIndex: 10"&gt;</w:t>
-            </w:r>
-            <w:r>
-              <w:rPr>
-                <w:rFonts w:ascii="Consolas" w:hAnsi="Consolas"/>
-                <w:color w:val="1E293B"/>
-                <w:sz w:val="17"/>
-              </w:rPr>
-              <w:br/>
-              <w:t xml:space="preserve">            &lt;a-gltf-model </w:t>
-            </w:r>
-            <w:r>
-              <w:rPr>
-                <w:rFonts w:ascii="Consolas" w:hAnsi="Consolas"/>
-                <w:color w:val="1E293B"/>
-                <w:sz w:val="17"/>
-              </w:rPr>
-              <w:br/>
-              <w:t xml:space="preserve">                src="#hatModel" </w:t>
-            </w:r>
-            <w:r>
-              <w:rPr>
-                <w:rFonts w:ascii="Consolas" w:hAnsi="Consolas"/>
-                <w:color w:val="1E293B"/>
-                <w:sz w:val="17"/>
-              </w:rPr>
-              <w:br/>
-              <w:t xml:space="preserve">                rotation="0 0 0" </w:t>
-            </w:r>
-            <w:r>
-              <w:rPr>
-                <w:rFonts w:ascii="Consolas" w:hAnsi="Consolas"/>
-                <w:color w:val="1E293B"/>
-                <w:sz w:val="17"/>
-              </w:rPr>
-              <w:br/>
-              <w:t xml:space="preserve">                position="0 0.15 -0.05" </w:t>
-            </w:r>
-            <w:r>
-              <w:rPr>
-                <w:rFonts w:ascii="Consolas" w:hAnsi="Consolas"/>
-                <w:color w:val="1E293B"/>
-                <w:sz w:val="17"/>
-              </w:rPr>
-              <w:br/>
-            </w:r>
-            <w:r>
-              <w:rPr>
-                <w:rFonts w:ascii="Consolas" w:hAnsi="Consolas"/>
-                <w:color w:val="1E293B"/>
-                <w:sz w:val="17"/>
-              </w:rPr>
-              <w:lastRenderedPageBreak/>
-              <w:t xml:space="preserve">                scale="0.35 0.35 0.35"&gt;</w:t>
-            </w:r>
-            <w:r>
-              <w:rPr>
-                <w:rFonts w:ascii="Consolas" w:hAnsi="Consolas"/>
-                <w:color w:val="1E293B"/>
-                <w:sz w:val="17"/>
-              </w:rPr>
-              <w:br/>
-              <w:t xml:space="preserve">            &lt;/a-gltf-model&gt;</w:t>
-            </w:r>
-            <w:r>
-              <w:rPr>
-                <w:rFonts w:ascii="Consolas" w:hAnsi="Consolas"/>
-                <w:color w:val="1E293B"/>
-                <w:sz w:val="17"/>
-              </w:rPr>
-              <w:br/>
-              <w:t xml:space="preserve">        &lt;/a-entity&gt;</w:t>
-            </w:r>
-            <w:r>
-              <w:rPr>
-                <w:rFonts w:ascii="Consolas" w:hAnsi="Consolas"/>
-                <w:color w:val="1E293B"/>
-                <w:sz w:val="17"/>
-              </w:rPr>
-              <w:br/>
-              <w:t xml:space="preserve">    &lt;/a-scene&gt;</w:t>
-            </w:r>
-            <w:r>
-              <w:rPr>
-                <w:rFonts w:ascii="Consolas" w:hAnsi="Consolas"/>
-                <w:color w:val="1E293B"/>
-                <w:sz w:val="17"/>
-              </w:rPr>
-              <w:br/>
-              <w:t>&lt;/body&gt;</w:t>
-            </w:r>
-            <w:r>
-              <w:rPr>
-                <w:rFonts w:ascii="Consolas" w:hAnsi="Consolas"/>
-                <w:color w:val="1E293B"/>
-                <w:sz w:val="17"/>
-              </w:rPr>
-              <w:br/>
-              <w:t>&lt;/html&gt;</w:t>
-            </w:r>
-          </w:p>
-        </w:tc>
-      </w:tr>
-    </w:tbl>
-    <w:p/>
-    <w:p>
-      <w:pPr>
-        <w:spacing w:before="240"/>
-        <w:rPr>
-          <w:lang w:val="ru-RU"/>
-        </w:rPr>
-      </w:pPr>
-      <w:r>
-        <w:rPr>
-          <w:b/>
-          <w:lang w:val="ru-RU"/>
-        </w:rPr>
-        <w:t>Развертывание и тестирование:</w:t>
-      </w:r>
-    </w:p>
-    <w:p>
-      <w:r>
-        <w:rPr>
-          <w:lang w:val="ru-RU"/>
-        </w:rPr>
-        <w:t xml:space="preserve">При включении фронтальной камеры нейросеть </w:t>
-      </w:r>
-      <w:proofErr w:type="spellStart"/>
-      <w:r>
-        <w:t>MediaPipe</w:t>
-      </w:r>
-      <w:proofErr w:type="spellEnd"/>
-      <w:r>
-        <w:rPr>
-          <w:lang w:val="ru-RU"/>
-        </w:rPr>
-        <w:t xml:space="preserve"> находит лицо пользователя и «надевает» поварской колпак шефа. </w:t>
-      </w:r>
-      <w:r>
-        <w:t>Модель аккуратно следует за движениями и поворотами головы.</w:t>
-      </w:r>
-    </w:p>
-    <w:p>
-      <w:pPr>
-        <w:jc w:val="center"/>
-      </w:pPr>
-      <w:r>
-        <w:rPr>
-          <w:noProof/>
-        </w:rPr>
-        <w:drawing>
-          <wp:inline distT="0" distB="0" distL="0" distR="0" wp14:anchorId="726B1D34" wp14:editId="51139201">
-            <wp:extent cx="4526280" cy="4138922"/>
-            <wp:effectExtent l="0" t="0" r="7620" b="0"/>
-            <wp:docPr id="91966285" name="Рисунок 1"/>
-            <wp:cNvGraphicFramePr>
-              <a:graphicFrameLocks xmlns:a="http://schemas.openxmlformats.org/drawingml/2006/main" noChangeAspect="1"/>
-            </wp:cNvGraphicFramePr>
-            <a:graphic xmlns:a="http://schemas.openxmlformats.org/drawingml/2006/main">
-              <a:graphicData uri="http://schemas.openxmlformats.org/drawingml/2006/picture">
-                <pic:pic xmlns:pic="http://schemas.openxmlformats.org/drawingml/2006/picture">
-                  <pic:nvPicPr>
-                    <pic:cNvPr id="91966285" name="Рисунок 91966285"/>
-                    <pic:cNvPicPr/>
-                  </pic:nvPicPr>
-                  <pic:blipFill>
-                    <a:blip r:embed="rId10"/>
-                    <a:stretch>
-                      <a:fillRect/>
-                    </a:stretch>
-                  </pic:blipFill>
-                  <pic:spPr>
-                    <a:xfrm>
-                      <a:off x="0" y="0"/>
-                      <a:ext cx="4532575" cy="4144678"/>
-                    </a:xfrm>
-                    <a:prstGeom prst="rect">
-                      <a:avLst/>
-                    </a:prstGeom>
-                  </pic:spPr>
-                </pic:pic>
-              </a:graphicData>
-            </a:graphic>
-          </wp:inline>
-        </w:drawing>
-      </w:r>
-    </w:p>
-    <w:p>
-      <w:r>
-        <w:br w:type="page"/>
-      </w:r>
-    </w:p>
-    <w:p>
-      <w:pPr>
-        <w:spacing w:before="240"/>
-        <w:jc w:val="center"/>
-      </w:pPr>
-      <w:r>
-        <w:rPr>
-          <w:b/>
-          <w:sz w:val="28"/>
-        </w:rPr>
-        <w:lastRenderedPageBreak/>
-        <w:t>ЗАДАНИЕ 4</w:t>
-      </w:r>
-    </w:p>
-    <w:p>
-      <w:pPr>
-        <w:jc w:val="center"/>
-        <w:rPr>
-          <w:lang w:val="ru-RU"/>
-        </w:rPr>
-      </w:pPr>
-      <w:r>
-        <w:rPr>
-          <w:b/>
-          <w:lang w:val="ru-RU"/>
-        </w:rPr>
-        <w:t xml:space="preserve">Тема: Создание </w:t>
-      </w:r>
-      <w:r>
-        <w:rPr>
-          <w:b/>
-        </w:rPr>
-        <w:t>AR</w:t>
-      </w:r>
-      <w:r>
-        <w:rPr>
-          <w:b/>
-          <w:lang w:val="ru-RU"/>
-        </w:rPr>
-        <w:t xml:space="preserve">-сцены на </w:t>
-      </w:r>
-      <w:r>
-        <w:rPr>
-          <w:b/>
-        </w:rPr>
-        <w:t>Three</w:t>
-      </w:r>
-      <w:r>
-        <w:rPr>
-          <w:b/>
-          <w:lang w:val="ru-RU"/>
-        </w:rPr>
-        <w:t>.</w:t>
-      </w:r>
-      <w:proofErr w:type="spellStart"/>
-      <w:r>
-        <w:rPr>
-          <w:b/>
-        </w:rPr>
-        <w:t>js</w:t>
-      </w:r>
-      <w:proofErr w:type="spellEnd"/>
-      <w:r>
-        <w:rPr>
-          <w:b/>
-          <w:lang w:val="ru-RU"/>
-        </w:rPr>
-        <w:t xml:space="preserve"> с размещением объекта через </w:t>
-      </w:r>
-      <w:r>
-        <w:rPr>
-          <w:b/>
-        </w:rPr>
-        <w:t>hit</w:t>
-      </w:r>
-      <w:r>
-        <w:rPr>
-          <w:b/>
-          <w:lang w:val="ru-RU"/>
-        </w:rPr>
-        <w:t>-</w:t>
-      </w:r>
-      <w:r>
-        <w:rPr>
-          <w:b/>
-        </w:rPr>
-        <w:t>test</w:t>
-      </w:r>
-    </w:p>
-    <w:p>
-      <w:pPr>
-        <w:spacing w:before="240"/>
-      </w:pPr>
-      <w:proofErr w:type="spellStart"/>
-      <w:r>
-        <w:rPr>
-          <w:b/>
-        </w:rPr>
-        <w:t>Требования</w:t>
-      </w:r>
-      <w:proofErr w:type="spellEnd"/>
-      <w:r>
-        <w:rPr>
-          <w:b/>
-        </w:rPr>
-        <w:t>:</w:t>
-      </w:r>
-    </w:p>
-    <w:p>
-      <w:pPr>
-        <w:pStyle w:val="a0"/>
-      </w:pPr>
-      <w:r>
-        <w:t>Используется Three.js и WebXR API с immersive-ar сессией.</w:t>
-      </w:r>
-    </w:p>
-    <w:p>
-      <w:pPr>
-        <w:pStyle w:val="a0"/>
-      </w:pPr>
-      <w:r>
-        <w:t>Инициализация AR-сессии (navigator.xr.requestSession) настроена корректно.</w:t>
-      </w:r>
-    </w:p>
-    <w:p>
-      <w:pPr>
-        <w:pStyle w:val="a0"/>
-      </w:pPr>
-      <w:r>
-        <w:t>Реализован hit-test через XRHitTestSource и getHitTestResults.</w:t>
-      </w:r>
-    </w:p>
-    <w:p>
-      <w:pPr>
-        <w:pStyle w:val="a0"/>
-        <w:rPr>
-          <w:lang w:val="ru-RU"/>
-        </w:rPr>
-      </w:pPr>
-      <w:r>
-        <w:rPr>
-          <w:lang w:val="ru-RU"/>
-        </w:rPr>
-        <w:t xml:space="preserve">Добавлен визуальный маркер (кольцо или </w:t>
-      </w:r>
-      <w:proofErr w:type="spellStart"/>
-      <w:r>
-        <w:rPr>
-          <w:lang w:val="ru-RU"/>
-        </w:rPr>
-        <w:t>ретикал</w:t>
-      </w:r>
-      <w:proofErr w:type="spellEnd"/>
-      <w:r>
-        <w:rPr>
-          <w:lang w:val="ru-RU"/>
-        </w:rPr>
-        <w:t xml:space="preserve">), привязанный к результатам </w:t>
-      </w:r>
-      <w:r>
-        <w:t>hit</w:t>
-      </w:r>
-      <w:r>
-        <w:rPr>
-          <w:lang w:val="ru-RU"/>
-        </w:rPr>
-        <w:t>-</w:t>
-      </w:r>
-      <w:r>
-        <w:t>test</w:t>
-      </w:r>
-      <w:r>
-        <w:rPr>
-          <w:lang w:val="ru-RU"/>
-        </w:rPr>
-        <w:t>.</w:t>
-      </w:r>
-    </w:p>
-    <w:p>
-      <w:pPr>
-        <w:pStyle w:val="a0"/>
-        <w:rPr>
-          <w:lang w:val="ru-RU"/>
-        </w:rPr>
-      </w:pPr>
-      <w:r>
-        <w:rPr>
-          <w:lang w:val="ru-RU"/>
-        </w:rPr>
-        <w:t>При тапе/клике объект размещается в точке соприкосновения и фиксируется.</w:t>
-      </w:r>
-    </w:p>
-    <w:p>
-      <w:pPr>
-        <w:pStyle w:val="a0"/>
-        <w:rPr>
-          <w:lang w:val="ru-RU"/>
-        </w:rPr>
-      </w:pPr>
-      <w:r>
-        <w:rPr>
-          <w:lang w:val="ru-RU"/>
-        </w:rPr>
-        <w:t>После размещения объект остаётся на месте и не «едет» с камерой.</w:t>
-      </w:r>
-    </w:p>
-    <w:p>
-      <w:pPr>
-        <w:spacing w:before="240"/>
-        <w:rPr>
-          <w:lang w:val="ru-RU"/>
-        </w:rPr>
-      </w:pPr>
-      <w:r>
-        <w:rPr>
-          <w:b/>
-          <w:lang w:val="ru-RU"/>
-        </w:rPr>
-        <w:t>Описание выполнения работы:</w:t>
-      </w:r>
-    </w:p>
-    <w:p>
-      <w:pPr>
-        <w:rPr>
-          <w:lang w:val="ru-RU"/>
-        </w:rPr>
-      </w:pPr>
-      <w:r>
-        <w:rPr>
-          <w:b/>
-          <w:lang w:val="ru-RU"/>
-        </w:rPr>
-        <w:t xml:space="preserve">Инициализация </w:t>
-      </w:r>
-      <w:r>
-        <w:rPr>
-          <w:b/>
-        </w:rPr>
-        <w:t>Three</w:t>
-      </w:r>
-      <w:r>
-        <w:rPr>
-          <w:b/>
-          <w:lang w:val="ru-RU"/>
-        </w:rPr>
-        <w:t>.</w:t>
-      </w:r>
-      <w:proofErr w:type="spellStart"/>
-      <w:r>
-        <w:rPr>
-          <w:b/>
-        </w:rPr>
-        <w:t>js</w:t>
-      </w:r>
-      <w:proofErr w:type="spellEnd"/>
-      <w:r>
-        <w:rPr>
-          <w:b/>
-          <w:lang w:val="ru-RU"/>
-        </w:rPr>
-        <w:t xml:space="preserve"> и </w:t>
-      </w:r>
-      <w:proofErr w:type="spellStart"/>
-      <w:r>
-        <w:rPr>
-          <w:b/>
-        </w:rPr>
-        <w:t>WebXR</w:t>
-      </w:r>
-      <w:proofErr w:type="spellEnd"/>
-      <w:r>
-        <w:rPr>
-          <w:b/>
-          <w:lang w:val="ru-RU"/>
-        </w:rPr>
-        <w:t xml:space="preserve">. </w:t>
-      </w:r>
-      <w:r>
-        <w:rPr>
-          <w:lang w:val="ru-RU"/>
-        </w:rPr>
-        <w:t xml:space="preserve">Создано </w:t>
-      </w:r>
-      <w:proofErr w:type="spellStart"/>
-      <w:r>
-        <w:t>WebAR</w:t>
-      </w:r>
-      <w:proofErr w:type="spellEnd"/>
-      <w:r>
-        <w:rPr>
-          <w:lang w:val="ru-RU"/>
-        </w:rPr>
-        <w:t xml:space="preserve">-приложение на библиотеке </w:t>
-      </w:r>
-      <w:r>
-        <w:t>Three</w:t>
-      </w:r>
-      <w:r>
-        <w:rPr>
-          <w:lang w:val="ru-RU"/>
-        </w:rPr>
-        <w:t>.</w:t>
-      </w:r>
-      <w:proofErr w:type="spellStart"/>
-      <w:r>
-        <w:t>js</w:t>
-      </w:r>
-      <w:proofErr w:type="spellEnd"/>
-      <w:r>
-        <w:rPr>
-          <w:lang w:val="ru-RU"/>
-        </w:rPr>
-        <w:t xml:space="preserve"> с использованием браузерного </w:t>
-      </w:r>
-      <w:proofErr w:type="spellStart"/>
-      <w:r>
-        <w:t>WebXR</w:t>
-      </w:r>
-      <w:proofErr w:type="spellEnd"/>
-      <w:r>
-        <w:rPr>
-          <w:lang w:val="ru-RU"/>
-        </w:rPr>
-        <w:t xml:space="preserve"> </w:t>
-      </w:r>
-      <w:r>
-        <w:t>API</w:t>
-      </w:r>
-      <w:r>
-        <w:rPr>
-          <w:lang w:val="ru-RU"/>
-        </w:rPr>
-        <w:t xml:space="preserve">. Использован модуль </w:t>
-      </w:r>
-      <w:proofErr w:type="spellStart"/>
-      <w:r>
-        <w:t>ARButton</w:t>
-      </w:r>
-      <w:proofErr w:type="spellEnd"/>
-      <w:r>
-        <w:rPr>
-          <w:lang w:val="ru-RU"/>
-        </w:rPr>
-        <w:t xml:space="preserve"> с параметром </w:t>
-      </w:r>
-      <w:proofErr w:type="spellStart"/>
-      <w:r>
-        <w:t>requiredFeatures</w:t>
-      </w:r>
-      <w:proofErr w:type="spellEnd"/>
-      <w:r>
-        <w:rPr>
-          <w:lang w:val="ru-RU"/>
-        </w:rPr>
-        <w:t>: ['</w:t>
-      </w:r>
-      <w:r>
-        <w:t>hit</w:t>
-      </w:r>
-      <w:r>
-        <w:rPr>
-          <w:lang w:val="ru-RU"/>
-        </w:rPr>
-        <w:t>-</w:t>
-      </w:r>
-      <w:r>
-        <w:t>test</w:t>
-      </w:r>
-      <w:r>
-        <w:rPr>
-          <w:lang w:val="ru-RU"/>
-        </w:rPr>
-        <w:t xml:space="preserve">'] для сессии типа </w:t>
-      </w:r>
-      <w:r>
-        <w:t>immersive</w:t>
-      </w:r>
-      <w:r>
-        <w:rPr>
-          <w:lang w:val="ru-RU"/>
-        </w:rPr>
-        <w:t>-</w:t>
-      </w:r>
-      <w:proofErr w:type="spellStart"/>
-      <w:r>
-        <w:t>ar</w:t>
-      </w:r>
-      <w:proofErr w:type="spellEnd"/>
-      <w:r>
-        <w:rPr>
-          <w:lang w:val="ru-RU"/>
-        </w:rPr>
-        <w:t>.</w:t>
-      </w:r>
-    </w:p>
-    <w:p>
-      <w:pPr>
-        <w:rPr>
-          <w:lang w:val="ru-RU"/>
-        </w:rPr>
-      </w:pPr>
-      <w:r>
-        <w:rPr>
-          <w:b/>
-          <w:lang w:val="ru-RU"/>
-        </w:rPr>
-        <w:t xml:space="preserve">Реализация </w:t>
-      </w:r>
-      <w:r>
-        <w:rPr>
-          <w:b/>
-        </w:rPr>
-        <w:t>Hit</w:t>
-      </w:r>
-      <w:r>
-        <w:rPr>
-          <w:b/>
-          <w:lang w:val="ru-RU"/>
-        </w:rPr>
-        <w:t>-</w:t>
-      </w:r>
-      <w:r>
-        <w:rPr>
-          <w:b/>
-        </w:rPr>
-        <w:t>Test</w:t>
-      </w:r>
-      <w:r>
-        <w:rPr>
-          <w:b/>
-          <w:lang w:val="ru-RU"/>
-        </w:rPr>
-        <w:t xml:space="preserve"> и кольца-прицела. </w:t>
-      </w:r>
-      <w:r>
-        <w:t xml:space="preserve">Через session.requestHitTestSource создан луч hit-test. </w:t>
-      </w:r>
-      <w:r>
-        <w:rPr>
-          <w:lang w:val="ru-RU"/>
-        </w:rPr>
-        <w:t>В цикле рендеринга результаты пересечения луча с полом передаются в кольцо-прицел (</w:t>
-      </w:r>
-      <w:r>
-        <w:t>reticle</w:t>
-      </w:r>
-      <w:r>
-        <w:rPr>
-          <w:lang w:val="ru-RU"/>
-        </w:rPr>
-        <w:t>). При касании экрана (событие '</w:t>
-      </w:r>
-      <w:r>
-        <w:t>select</w:t>
-      </w:r>
-      <w:r>
-        <w:rPr>
-          <w:lang w:val="ru-RU"/>
-        </w:rPr>
-        <w:t>') создается модель круглого ресторанного столика, которая привязывается к координатам пола (</w:t>
-      </w:r>
-      <w:r>
-        <w:t>local</w:t>
-      </w:r>
-      <w:r>
-        <w:rPr>
-          <w:lang w:val="ru-RU"/>
-        </w:rPr>
-        <w:t>-</w:t>
-      </w:r>
-      <w:r>
-        <w:t>floor</w:t>
-      </w:r>
-      <w:r>
-        <w:rPr>
-          <w:lang w:val="ru-RU"/>
-        </w:rPr>
-        <w:t>) и остается на месте при перемещении камеры.</w:t>
-      </w:r>
-    </w:p>
-    <w:p>
-      <w:pPr>
-        <w:spacing w:before="240"/>
-      </w:pPr>
-      <w:proofErr w:type="spellStart"/>
-      <w:r>
-        <w:rPr>
-          <w:b/>
-        </w:rPr>
-        <w:t>Листинг</w:t>
-      </w:r>
-      <w:proofErr w:type="spellEnd"/>
-      <w:r>
-        <w:rPr>
-          <w:b/>
-        </w:rPr>
-        <w:t xml:space="preserve"> </w:t>
-      </w:r>
-      <w:proofErr w:type="spellStart"/>
-      <w:r>
-        <w:rPr>
-          <w:b/>
-        </w:rPr>
-        <w:t>кода</w:t>
-      </w:r>
-      <w:proofErr w:type="spellEnd"/>
-      <w:r>
-        <w:rPr>
-          <w:b/>
-        </w:rPr>
-        <w:t xml:space="preserve"> index.html:</w:t>
-      </w:r>
-    </w:p>
-    <w:tbl>
-      <w:tblPr>
-        <w:tblW w:w="0" w:type="auto"/>
-        <w:jc w:val="center"/>
-        <w:tblLook w:val="04A0" w:firstRow="1" w:lastRow="0" w:firstColumn="1" w:lastColumn="0" w:noHBand="0" w:noVBand="1"/>
-      </w:tblPr>
-      <w:tblGrid>
-        <w:gridCol w:w="9360"/>
-      </w:tblGrid>
-      <w:tr>
-        <w:trPr>
-          <w:jc w:val="center"/>
-        </w:trPr>
-        <w:tc>
-          <w:tcPr>
-            <w:tcW w:w="9360" w:type="dxa"/>
-            <w:tcBorders>
-              <w:top w:val="single" w:sz="4" w:space="0" w:color="94A3B8"/>
-              <w:left w:val="single" w:sz="4" w:space="0" w:color="94A3B8"/>
-              <w:bottom w:val="single" w:sz="4" w:space="0" w:color="94A3B8"/>
-              <w:right w:val="single" w:sz="4" w:space="0" w:color="94A3B8"/>
-            </w:tcBorders>
-            <w:shd w:val="clear" w:color="auto" w:fill="F8FAFC"/>
-          </w:tcPr>
-          <w:p>
-            <w:pPr>
-              <w:spacing w:after="0" w:line="240" w:lineRule="auto"/>
-            </w:pPr>
-            <w:r>
-              <w:rPr>
-                <w:rFonts w:ascii="Consolas" w:hAnsi="Consolas"/>
-                <w:color w:val="1E293B"/>
-                <w:sz w:val="17"/>
-              </w:rPr>
-              <w:t>&lt;!DOCTYPE html&gt;</w:t>
-            </w:r>
-            <w:r>
-              <w:rPr>
-                <w:rFonts w:ascii="Consolas" w:hAnsi="Consolas"/>
-                <w:color w:val="1E293B"/>
-                <w:sz w:val="17"/>
-              </w:rPr>
-              <w:br/>
-              <w:t>&lt;html lang="ru"&gt;</w:t>
-            </w:r>
-            <w:r>
-              <w:rPr>
-                <w:rFonts w:ascii="Consolas" w:hAnsi="Consolas"/>
-                <w:color w:val="1E293B"/>
-                <w:sz w:val="17"/>
-              </w:rPr>
-              <w:br/>
-              <w:t>&lt;head&gt;</w:t>
-            </w:r>
-            <w:r>
-              <w:rPr>
-                <w:rFonts w:ascii="Consolas" w:hAnsi="Consolas"/>
-                <w:color w:val="1E293B"/>
-                <w:sz w:val="17"/>
-              </w:rPr>
-              <w:br/>
-              <w:t xml:space="preserve">    &lt;meta charset="UTF-8"&gt;</w:t>
-            </w:r>
-            <w:r>
-              <w:rPr>
-                <w:rFonts w:ascii="Consolas" w:hAnsi="Consolas"/>
-                <w:color w:val="1E293B"/>
-                <w:sz w:val="17"/>
-              </w:rPr>
-              <w:br/>
-              <w:t xml:space="preserve">    &lt;meta name="viewport" content="width=device-width, initial-scale=1.0, user-scalable=no"&gt;</w:t>
-            </w:r>
-            <w:r>
-              <w:rPr>
-                <w:rFonts w:ascii="Consolas" w:hAnsi="Consolas"/>
-                <w:color w:val="1E293B"/>
-                <w:sz w:val="17"/>
-              </w:rPr>
-              <w:br/>
-              <w:t xml:space="preserve">    &lt;title&gt;WebAR Задание 4 - Размещение столика&lt;/title&gt;</w:t>
-            </w:r>
-            <w:r>
-              <w:rPr>
-                <w:rFonts w:ascii="Consolas" w:hAnsi="Consolas"/>
-                <w:color w:val="1E293B"/>
-                <w:sz w:val="17"/>
-              </w:rPr>
-              <w:br/>
-              <w:t xml:space="preserve">    &lt;style&gt;</w:t>
-            </w:r>
-            <w:r>
-              <w:rPr>
-                <w:rFonts w:ascii="Consolas" w:hAnsi="Consolas"/>
-                <w:color w:val="1E293B"/>
-                <w:sz w:val="17"/>
-              </w:rPr>
-              <w:br/>
-              <w:t xml:space="preserve">        body { margin: 0; overflow: hidden; background: #000; font-family: sans-serif; }</w:t>
-            </w:r>
-            <w:r>
-              <w:rPr>
-                <w:rFonts w:ascii="Consolas" w:hAnsi="Consolas"/>
-                <w:color w:val="1E293B"/>
-                <w:sz w:val="17"/>
-              </w:rPr>
-              <w:br/>
-              <w:t xml:space="preserve">        #info { position: absolute; top: 20px; width: 100%; text-align: center; color: white; font-size: 15px; z-index: 10; pointer-events: none; }</w:t>
-            </w:r>
-            <w:r>
-              <w:rPr>
-                <w:rFonts w:ascii="Consolas" w:hAnsi="Consolas"/>
-                <w:color w:val="1E293B"/>
-                <w:sz w:val="17"/>
-              </w:rPr>
-              <w:br/>
-              <w:t xml:space="preserve">    &lt;/style&gt;</w:t>
-            </w:r>
-            <w:r>
-              <w:rPr>
-                <w:rFonts w:ascii="Consolas" w:hAnsi="Consolas"/>
-                <w:color w:val="1E293B"/>
-                <w:sz w:val="17"/>
-              </w:rPr>
-              <w:br/>
-              <w:t>&lt;/head&gt;</w:t>
-            </w:r>
-            <w:r>
-              <w:rPr>
-                <w:rFonts w:ascii="Consolas" w:hAnsi="Consolas"/>
-                <w:color w:val="1E293B"/>
-                <w:sz w:val="17"/>
-              </w:rPr>
-              <w:br/>
-              <w:t>&lt;body&gt;</w:t>
-            </w:r>
-            <w:r>
-              <w:rPr>
-                <w:rFonts w:ascii="Consolas" w:hAnsi="Consolas"/>
-                <w:color w:val="1E293B"/>
-                <w:sz w:val="17"/>
-              </w:rPr>
-              <w:br/>
-              <w:t xml:space="preserve">    &lt;div id="info"&gt;Наведите камеру на пол и коснитесь экрана, чтобы поставить столик&lt;/div&gt;</w:t>
-            </w:r>
-            <w:r>
-              <w:rPr>
-                <w:rFonts w:ascii="Consolas" w:hAnsi="Consolas"/>
-                <w:color w:val="1E293B"/>
-                <w:sz w:val="17"/>
-              </w:rPr>
-              <w:br/>
-            </w:r>
-            <w:r>
-              <w:rPr>
-                <w:rFonts w:ascii="Consolas" w:hAnsi="Consolas"/>
-                <w:color w:val="1E293B"/>
-                <w:sz w:val="17"/>
-              </w:rPr>
-              <w:br/>
-              <w:t xml:space="preserve">    &lt;script type="module"&gt;</w:t>
-            </w:r>
-            <w:r>
-              <w:rPr>
-                <w:rFonts w:ascii="Consolas" w:hAnsi="Consolas"/>
-                <w:color w:val="1E293B"/>
-                <w:sz w:val="17"/>
-              </w:rPr>
-              <w:br/>
-              <w:t xml:space="preserve">        import * as THREE from 'https://unpkg.com/three@0.160.0/build/three.module.js';</w:t>
-            </w:r>
-            <w:r>
-              <w:rPr>
-                <w:rFonts w:ascii="Consolas" w:hAnsi="Consolas"/>
-                <w:color w:val="1E293B"/>
-                <w:sz w:val="17"/>
-              </w:rPr>
-              <w:br/>
-              <w:t xml:space="preserve">        import { ARButton } from 'https://unpkg.com/three@0.160.0/examples/jsm/webxr/ARButton.js';</w:t>
-            </w:r>
-            <w:r>
-              <w:rPr>
-                <w:rFonts w:ascii="Consolas" w:hAnsi="Consolas"/>
-                <w:color w:val="1E293B"/>
-                <w:sz w:val="17"/>
-              </w:rPr>
-              <w:br/>
-            </w:r>
-            <w:r>
-              <w:rPr>
-                <w:rFonts w:ascii="Consolas" w:hAnsi="Consolas"/>
-                <w:color w:val="1E293B"/>
-                <w:sz w:val="17"/>
-              </w:rPr>
-              <w:br/>
-              <w:t xml:space="preserve">        let camera, scene, renderer, controller, reticle;</w:t>
-            </w:r>
-            <w:r>
-              <w:rPr>
-                <w:rFonts w:ascii="Consolas" w:hAnsi="Consolas"/>
-                <w:color w:val="1E293B"/>
-                <w:sz w:val="17"/>
-              </w:rPr>
-              <w:br/>
-              <w:t xml:space="preserve">        let hitTestSource = null, hitTestSourceRequested = false;</w:t>
-            </w:r>
-            <w:r>
-              <w:rPr>
-                <w:rFonts w:ascii="Consolas" w:hAnsi="Consolas"/>
-                <w:color w:val="1E293B"/>
-                <w:sz w:val="17"/>
-              </w:rPr>
-              <w:br/>
-            </w:r>
-            <w:r>
-              <w:rPr>
-                <w:rFonts w:ascii="Consolas" w:hAnsi="Consolas"/>
-                <w:color w:val="1E293B"/>
-                <w:sz w:val="17"/>
-              </w:rPr>
-              <w:br/>
-              <w:t xml:space="preserve">        init();</w:t>
-            </w:r>
-            <w:r>
-              <w:rPr>
-                <w:rFonts w:ascii="Consolas" w:hAnsi="Consolas"/>
-                <w:color w:val="1E293B"/>
-                <w:sz w:val="17"/>
-              </w:rPr>
-              <w:br/>
-            </w:r>
-            <w:r>
-              <w:rPr>
-                <w:rFonts w:ascii="Consolas" w:hAnsi="Consolas"/>
-                <w:color w:val="1E293B"/>
-                <w:sz w:val="17"/>
-              </w:rPr>
-              <w:br/>
-              <w:t xml:space="preserve">        function init() {</w:t>
-            </w:r>
-            <w:r>
-              <w:rPr>
-                <w:rFonts w:ascii="Consolas" w:hAnsi="Consolas"/>
-                <w:color w:val="1E293B"/>
-                <w:sz w:val="17"/>
-              </w:rPr>
-              <w:br/>
-              <w:t xml:space="preserve">            scene = new THREE.Scene();</w:t>
-            </w:r>
-            <w:r>
-              <w:rPr>
-                <w:rFonts w:ascii="Consolas" w:hAnsi="Consolas"/>
-                <w:color w:val="1E293B"/>
-                <w:sz w:val="17"/>
-              </w:rPr>
-              <w:br/>
-              <w:t xml:space="preserve">            camera = new THREE.PerspectiveCamera(70, window.innerWidth / window.innerHeight, 0.01, 20);</w:t>
-            </w:r>
-            <w:r>
-              <w:rPr>
-                <w:rFonts w:ascii="Consolas" w:hAnsi="Consolas"/>
-                <w:color w:val="1E293B"/>
-                <w:sz w:val="17"/>
-              </w:rPr>
-              <w:br/>
-            </w:r>
-            <w:r>
-              <w:rPr>
-                <w:rFonts w:ascii="Consolas" w:hAnsi="Consolas"/>
-                <w:color w:val="1E293B"/>
-                <w:sz w:val="17"/>
-              </w:rPr>
-              <w:br/>
-              <w:t xml:space="preserve">            // Освещение</w:t>
-            </w:r>
-            <w:r>
-              <w:rPr>
-                <w:rFonts w:ascii="Consolas" w:hAnsi="Consolas"/>
-                <w:color w:val="1E293B"/>
-                <w:sz w:val="17"/>
-              </w:rPr>
-              <w:br/>
-              <w:t xml:space="preserve">            const hemiLight = new THREE.HemisphereLight(0xffffff, 0xbbbbff, 2.5);</w:t>
-            </w:r>
-            <w:r>
-              <w:rPr>
-                <w:rFonts w:ascii="Consolas" w:hAnsi="Consolas"/>
-                <w:color w:val="1E293B"/>
-                <w:sz w:val="17"/>
-              </w:rPr>
-              <w:br/>
-            </w:r>
-            <w:r>
-              <w:rPr>
-                <w:rFonts w:ascii="Consolas" w:hAnsi="Consolas"/>
-                <w:color w:val="1E293B"/>
-                <w:sz w:val="17"/>
-              </w:rPr>
-              <w:lastRenderedPageBreak/>
-              <w:t xml:space="preserve">            scene.add(hemiLight);</w:t>
-            </w:r>
-            <w:r>
-              <w:rPr>
-                <w:rFonts w:ascii="Consolas" w:hAnsi="Consolas"/>
-                <w:color w:val="1E293B"/>
-                <w:sz w:val="17"/>
-              </w:rPr>
-              <w:br/>
-              <w:t xml:space="preserve">            const dirLight = new THREE.DirectionalLight(0xffeedd, 2.0);</w:t>
-            </w:r>
-            <w:r>
-              <w:rPr>
-                <w:rFonts w:ascii="Consolas" w:hAnsi="Consolas"/>
-                <w:color w:val="1E293B"/>
-                <w:sz w:val="17"/>
-              </w:rPr>
-              <w:br/>
-              <w:t xml:space="preserve">            dirLight.position.set(1, 2, 1);</w:t>
-            </w:r>
-            <w:r>
-              <w:rPr>
-                <w:rFonts w:ascii="Consolas" w:hAnsi="Consolas"/>
-                <w:color w:val="1E293B"/>
-                <w:sz w:val="17"/>
-              </w:rPr>
-              <w:br/>
-              <w:t xml:space="preserve">            scene.add(dirLight);</w:t>
-            </w:r>
-            <w:r>
-              <w:rPr>
-                <w:rFonts w:ascii="Consolas" w:hAnsi="Consolas"/>
-                <w:color w:val="1E293B"/>
-                <w:sz w:val="17"/>
-              </w:rPr>
-              <w:br/>
-            </w:r>
-            <w:r>
-              <w:rPr>
-                <w:rFonts w:ascii="Consolas" w:hAnsi="Consolas"/>
-                <w:color w:val="1E293B"/>
-                <w:sz w:val="17"/>
-              </w:rPr>
-              <w:br/>
-              <w:t xml:space="preserve">            // Рендерер</w:t>
-            </w:r>
-            <w:r>
-              <w:rPr>
-                <w:rFonts w:ascii="Consolas" w:hAnsi="Consolas"/>
-                <w:color w:val="1E293B"/>
-                <w:sz w:val="17"/>
-              </w:rPr>
-              <w:br/>
-              <w:t xml:space="preserve">            renderer = new THREE.WebGLRenderer({ antialias: true, alpha: true });</w:t>
-            </w:r>
-            <w:r>
-              <w:rPr>
-                <w:rFonts w:ascii="Consolas" w:hAnsi="Consolas"/>
-                <w:color w:val="1E293B"/>
-                <w:sz w:val="17"/>
-              </w:rPr>
-              <w:br/>
-              <w:t xml:space="preserve">            renderer.setSize(window.innerWidth, window.innerHeight);</w:t>
-            </w:r>
-            <w:r>
-              <w:rPr>
-                <w:rFonts w:ascii="Consolas" w:hAnsi="Consolas"/>
-                <w:color w:val="1E293B"/>
-                <w:sz w:val="17"/>
-              </w:rPr>
-              <w:br/>
-              <w:t xml:space="preserve">            renderer.xr.enabled = true;</w:t>
-            </w:r>
-            <w:r>
-              <w:rPr>
-                <w:rFonts w:ascii="Consolas" w:hAnsi="Consolas"/>
-                <w:color w:val="1E293B"/>
-                <w:sz w:val="17"/>
-              </w:rPr>
-              <w:br/>
-              <w:t xml:space="preserve">            document.body.appendChild(renderer.domElement);</w:t>
-            </w:r>
-            <w:r>
-              <w:rPr>
-                <w:rFonts w:ascii="Consolas" w:hAnsi="Consolas"/>
-                <w:color w:val="1E293B"/>
-                <w:sz w:val="17"/>
-              </w:rPr>
-              <w:br/>
-            </w:r>
-            <w:r>
-              <w:rPr>
-                <w:rFonts w:ascii="Consolas" w:hAnsi="Consolas"/>
-                <w:color w:val="1E293B"/>
-                <w:sz w:val="17"/>
-              </w:rPr>
-              <w:br/>
-              <w:t xml:space="preserve">            document.body.appendChild(ARButton.createButton(renderer, { requiredFeatures: ['hit-test'] }));</w:t>
-            </w:r>
-            <w:r>
-              <w:rPr>
-                <w:rFonts w:ascii="Consolas" w:hAnsi="Consolas"/>
-                <w:color w:val="1E293B"/>
-                <w:sz w:val="17"/>
-              </w:rPr>
-              <w:br/>
-            </w:r>
-            <w:r>
-              <w:rPr>
-                <w:rFonts w:ascii="Consolas" w:hAnsi="Consolas"/>
-                <w:color w:val="1E293B"/>
-                <w:sz w:val="17"/>
-              </w:rPr>
-              <w:br/>
-              <w:t xml:space="preserve">            // Столик ресторана</w:t>
-            </w:r>
-            <w:r>
-              <w:rPr>
-                <w:rFonts w:ascii="Consolas" w:hAnsi="Consolas"/>
-                <w:color w:val="1E293B"/>
-                <w:sz w:val="17"/>
-              </w:rPr>
-              <w:br/>
-              <w:t xml:space="preserve">            const table = new THREE.Group();</w:t>
-            </w:r>
-            <w:r>
-              <w:rPr>
-                <w:rFonts w:ascii="Consolas" w:hAnsi="Consolas"/>
-                <w:color w:val="1E293B"/>
-                <w:sz w:val="17"/>
-              </w:rPr>
-              <w:br/>
-              <w:t xml:space="preserve">            const topMesh = new THREE.Mesh(new THREE.CylinderGeometry(0.25, 0.25, 0.02, 32), new THREE.MeshStandardMaterial({ color: 0x8b5a2b, roughness: 0.3 }));</w:t>
-            </w:r>
-            <w:r>
-              <w:rPr>
-                <w:rFonts w:ascii="Consolas" w:hAnsi="Consolas"/>
-                <w:color w:val="1E293B"/>
-                <w:sz w:val="17"/>
-              </w:rPr>
-              <w:br/>
-              <w:t xml:space="preserve">            topMesh.position.y = 0.45;</w:t>
-            </w:r>
-            <w:r>
-              <w:rPr>
-                <w:rFonts w:ascii="Consolas" w:hAnsi="Consolas"/>
-                <w:color w:val="1E293B"/>
-                <w:sz w:val="17"/>
-              </w:rPr>
-              <w:br/>
-              <w:t xml:space="preserve">            table.add(topMesh);</w:t>
-            </w:r>
-            <w:r>
-              <w:rPr>
-                <w:rFonts w:ascii="Consolas" w:hAnsi="Consolas"/>
-                <w:color w:val="1E293B"/>
-                <w:sz w:val="17"/>
-              </w:rPr>
-              <w:br/>
-              <w:t xml:space="preserve">            const legMesh = new THREE.Mesh(new THREE.CylinderGeometry(0.025, 0.025, 0.44, 16), new THREE.MeshStandardMaterial({ color: 0x222222, metalness: 0.8 }));</w:t>
-            </w:r>
-            <w:r>
-              <w:rPr>
-                <w:rFonts w:ascii="Consolas" w:hAnsi="Consolas"/>
-                <w:color w:val="1E293B"/>
-                <w:sz w:val="17"/>
-              </w:rPr>
-              <w:br/>
-              <w:t xml:space="preserve">            legMesh.position.y = 0.22;</w:t>
-            </w:r>
-            <w:r>
-              <w:rPr>
-                <w:rFonts w:ascii="Consolas" w:hAnsi="Consolas"/>
-                <w:color w:val="1E293B"/>
-                <w:sz w:val="17"/>
-              </w:rPr>
-              <w:br/>
-              <w:t xml:space="preserve">            table.add(legMesh);</w:t>
-            </w:r>
-            <w:r>
-              <w:rPr>
-                <w:rFonts w:ascii="Consolas" w:hAnsi="Consolas"/>
-                <w:color w:val="1E293B"/>
-                <w:sz w:val="17"/>
-              </w:rPr>
-              <w:br/>
-              <w:t xml:space="preserve">            const baseMesh = new THREE.Mesh(new THREE.CylinderGeometry(0.18, 0.18, 0.015, 32), new THREE.MeshStandardMaterial({ color: 0x222222, metalness: 0.8 }));</w:t>
-            </w:r>
-            <w:r>
-              <w:rPr>
-                <w:rFonts w:ascii="Consolas" w:hAnsi="Consolas"/>
-                <w:color w:val="1E293B"/>
-                <w:sz w:val="17"/>
-              </w:rPr>
-              <w:br/>
-              <w:t xml:space="preserve">            baseMesh.position.y = 0.01;</w:t>
-            </w:r>
-            <w:r>
-              <w:rPr>
-                <w:rFonts w:ascii="Consolas" w:hAnsi="Consolas"/>
-                <w:color w:val="1E293B"/>
-                <w:sz w:val="17"/>
-              </w:rPr>
-              <w:br/>
-              <w:t xml:space="preserve">            table.add(baseMesh);</w:t>
-            </w:r>
-            <w:r>
-              <w:rPr>
-                <w:rFonts w:ascii="Consolas" w:hAnsi="Consolas"/>
-                <w:color w:val="1E293B"/>
-                <w:sz w:val="17"/>
-              </w:rPr>
-              <w:br/>
-            </w:r>
-            <w:r>
-              <w:rPr>
-                <w:rFonts w:ascii="Consolas" w:hAnsi="Consolas"/>
-                <w:color w:val="1E293B"/>
-                <w:sz w:val="17"/>
-              </w:rPr>
-              <w:br/>
-              <w:t xml:space="preserve">            function onSelect() {</w:t>
-            </w:r>
-            <w:r>
-              <w:rPr>
-                <w:rFonts w:ascii="Consolas" w:hAnsi="Consolas"/>
-                <w:color w:val="1E293B"/>
-                <w:sz w:val="17"/>
-              </w:rPr>
-              <w:br/>
-              <w:t xml:space="preserve">                if (reticle.visible) {</w:t>
-            </w:r>
-            <w:r>
-              <w:rPr>
-                <w:rFonts w:ascii="Consolas" w:hAnsi="Consolas"/>
-                <w:color w:val="1E293B"/>
-                <w:sz w:val="17"/>
-              </w:rPr>
-              <w:br/>
-              <w:t xml:space="preserve">                    const newTable = table.clone();</w:t>
-            </w:r>
-            <w:r>
-              <w:rPr>
-                <w:rFonts w:ascii="Consolas" w:hAnsi="Consolas"/>
-                <w:color w:val="1E293B"/>
-                <w:sz w:val="17"/>
-              </w:rPr>
-              <w:br/>
-              <w:t xml:space="preserve">                    reticle.matrix.decompose(newTable.position, newTable.quaternion, newTable.scale);</w:t>
-            </w:r>
-            <w:r>
-              <w:rPr>
-                <w:rFonts w:ascii="Consolas" w:hAnsi="Consolas"/>
-                <w:color w:val="1E293B"/>
-                <w:sz w:val="17"/>
-              </w:rPr>
-              <w:br/>
-              <w:t xml:space="preserve">                    scene.add(newTable);</w:t>
-            </w:r>
-            <w:r>
-              <w:rPr>
-                <w:rFonts w:ascii="Consolas" w:hAnsi="Consolas"/>
-                <w:color w:val="1E293B"/>
-                <w:sz w:val="17"/>
-              </w:rPr>
-              <w:br/>
-              <w:t xml:space="preserve">                }</w:t>
-            </w:r>
-            <w:r>
-              <w:rPr>
-                <w:rFonts w:ascii="Consolas" w:hAnsi="Consolas"/>
-                <w:color w:val="1E293B"/>
-                <w:sz w:val="17"/>
-              </w:rPr>
-              <w:br/>
-              <w:t xml:space="preserve">            }</w:t>
-            </w:r>
-            <w:r>
-              <w:rPr>
-                <w:rFonts w:ascii="Consolas" w:hAnsi="Consolas"/>
-                <w:color w:val="1E293B"/>
-                <w:sz w:val="17"/>
-              </w:rPr>
-              <w:br/>
-            </w:r>
-            <w:r>
-              <w:rPr>
-                <w:rFonts w:ascii="Consolas" w:hAnsi="Consolas"/>
-                <w:color w:val="1E293B"/>
-                <w:sz w:val="17"/>
-              </w:rPr>
-              <w:br/>
-              <w:t xml:space="preserve">            controller = renderer.xr.getController(0);</w:t>
-            </w:r>
-            <w:r>
-              <w:rPr>
-                <w:rFonts w:ascii="Consolas" w:hAnsi="Consolas"/>
-                <w:color w:val="1E293B"/>
-                <w:sz w:val="17"/>
-              </w:rPr>
-              <w:br/>
-              <w:t xml:space="preserve">            controller.addEventListener('select', onSelect);</w:t>
-            </w:r>
-            <w:r>
-              <w:rPr>
-                <w:rFonts w:ascii="Consolas" w:hAnsi="Consolas"/>
-                <w:color w:val="1E293B"/>
-                <w:sz w:val="17"/>
-              </w:rPr>
-              <w:br/>
-              <w:t xml:space="preserve">            scene.add(controller);</w:t>
-            </w:r>
-            <w:r>
-              <w:rPr>
-                <w:rFonts w:ascii="Consolas" w:hAnsi="Consolas"/>
-                <w:color w:val="1E293B"/>
-                <w:sz w:val="17"/>
-              </w:rPr>
-              <w:br/>
-            </w:r>
-            <w:r>
-              <w:rPr>
-                <w:rFonts w:ascii="Consolas" w:hAnsi="Consolas"/>
-                <w:color w:val="1E293B"/>
-                <w:sz w:val="17"/>
-              </w:rPr>
-              <w:br/>
-              <w:t xml:space="preserve">            // Прицел Hit-Test</w:t>
-            </w:r>
-            <w:r>
-              <w:rPr>
-                <w:rFonts w:ascii="Consolas" w:hAnsi="Consolas"/>
-                <w:color w:val="1E293B"/>
-                <w:sz w:val="17"/>
-              </w:rPr>
-              <w:br/>
-              <w:t xml:space="preserve">            reticle = new THREE.Mesh(new THREE.RingGeometry(0.15, 0.2, 32).rotateX(-Math.PI / 2), new THREE.MeshBasicMaterial({ color: 0xea580c }));</w:t>
-            </w:r>
-            <w:r>
-              <w:rPr>
-                <w:rFonts w:ascii="Consolas" w:hAnsi="Consolas"/>
-                <w:color w:val="1E293B"/>
-                <w:sz w:val="17"/>
-              </w:rPr>
-              <w:br/>
-              <w:t xml:space="preserve">            reticle.matrixAutoUpdate = false;</w:t>
-            </w:r>
-            <w:r>
-              <w:rPr>
-                <w:rFonts w:ascii="Consolas" w:hAnsi="Consolas"/>
-                <w:color w:val="1E293B"/>
-                <w:sz w:val="17"/>
-              </w:rPr>
-              <w:br/>
-              <w:t xml:space="preserve">            reticle.visible = false;</w:t>
-            </w:r>
-            <w:r>
-              <w:rPr>
-                <w:rFonts w:ascii="Consolas" w:hAnsi="Consolas"/>
-                <w:color w:val="1E293B"/>
-                <w:sz w:val="17"/>
-              </w:rPr>
-              <w:br/>
-              <w:t xml:space="preserve">            scene.add(reticle);</w:t>
-            </w:r>
-            <w:r>
-              <w:rPr>
-                <w:rFonts w:ascii="Consolas" w:hAnsi="Consolas"/>
-                <w:color w:val="1E293B"/>
-                <w:sz w:val="17"/>
-              </w:rPr>
-              <w:br/>
-            </w:r>
-            <w:r>
-              <w:rPr>
-                <w:rFonts w:ascii="Consolas" w:hAnsi="Consolas"/>
-                <w:color w:val="1E293B"/>
-                <w:sz w:val="17"/>
-              </w:rPr>
-              <w:br/>
-              <w:t xml:space="preserve">            renderer.setAnimationLoop(animate);</w:t>
-            </w:r>
-            <w:r>
-              <w:rPr>
-                <w:rFonts w:ascii="Consolas" w:hAnsi="Consolas"/>
-                <w:color w:val="1E293B"/>
-                <w:sz w:val="17"/>
-              </w:rPr>
-              <w:br/>
-              <w:t xml:space="preserve">        }</w:t>
-            </w:r>
-            <w:r>
-              <w:rPr>
-                <w:rFonts w:ascii="Consolas" w:hAnsi="Consolas"/>
-                <w:color w:val="1E293B"/>
-                <w:sz w:val="17"/>
-              </w:rPr>
-              <w:br/>
-            </w:r>
-            <w:r>
-              <w:rPr>
-                <w:rFonts w:ascii="Consolas" w:hAnsi="Consolas"/>
-                <w:color w:val="1E293B"/>
-                <w:sz w:val="17"/>
-              </w:rPr>
-              <w:br/>
-              <w:t xml:space="preserve">        function animate(timestamp, frame) {</w:t>
-            </w:r>
-            <w:r>
-              <w:rPr>
-                <w:rFonts w:ascii="Consolas" w:hAnsi="Consolas"/>
-                <w:color w:val="1E293B"/>
-                <w:sz w:val="17"/>
-              </w:rPr>
-              <w:br/>
-              <w:t xml:space="preserve">            if (frame) {</w:t>
-            </w:r>
-            <w:r>
-              <w:rPr>
-                <w:rFonts w:ascii="Consolas" w:hAnsi="Consolas"/>
-                <w:color w:val="1E293B"/>
-                <w:sz w:val="17"/>
-              </w:rPr>
-              <w:br/>
-              <w:t xml:space="preserve">                const refSpace = renderer.xr.getReferenceSpace();</w:t>
-            </w:r>
-            <w:r>
-              <w:rPr>
-                <w:rFonts w:ascii="Consolas" w:hAnsi="Consolas"/>
-                <w:color w:val="1E293B"/>
-                <w:sz w:val="17"/>
-              </w:rPr>
-              <w:br/>
-              <w:t xml:space="preserve">                const session = renderer.xr.getSession();</w:t>
-            </w:r>
-            <w:r>
-              <w:rPr>
-                <w:rFonts w:ascii="Consolas" w:hAnsi="Consolas"/>
-                <w:color w:val="1E293B"/>
-                <w:sz w:val="17"/>
-              </w:rPr>
-              <w:br/>
-            </w:r>
-            <w:r>
-              <w:rPr>
-                <w:rFonts w:ascii="Consolas" w:hAnsi="Consolas"/>
-                <w:color w:val="1E293B"/>
-                <w:sz w:val="17"/>
-              </w:rPr>
-              <w:br/>
-              <w:t xml:space="preserve">                if (!hitTestSourceRequested) {</w:t>
-            </w:r>
-            <w:r>
-              <w:rPr>
-                <w:rFonts w:ascii="Consolas" w:hAnsi="Consolas"/>
-                <w:color w:val="1E293B"/>
-                <w:sz w:val="17"/>
-              </w:rPr>
-              <w:br/>
-              <w:t xml:space="preserve">                    session.requestReferenceSpace('viewer').then(space =&gt; {</w:t>
-            </w:r>
-            <w:r>
-              <w:rPr>
-                <w:rFonts w:ascii="Consolas" w:hAnsi="Consolas"/>
-                <w:color w:val="1E293B"/>
-                <w:sz w:val="17"/>
-              </w:rPr>
-              <w:br/>
-              <w:t xml:space="preserve">                        session.requestHitTestSource({ space }).then(source =&gt; hitTestSource = source);</w:t>
-            </w:r>
-            <w:r>
-              <w:rPr>
-                <w:rFonts w:ascii="Consolas" w:hAnsi="Consolas"/>
-                <w:color w:val="1E293B"/>
-                <w:sz w:val="17"/>
-              </w:rPr>
-              <w:br/>
-              <w:t xml:space="preserve">                    });</w:t>
-            </w:r>
-            <w:r>
-              <w:rPr>
-                <w:rFonts w:ascii="Consolas" w:hAnsi="Consolas"/>
-                <w:color w:val="1E293B"/>
-                <w:sz w:val="17"/>
-              </w:rPr>
-              <w:br/>
-              <w:t xml:space="preserve">                    hitTestSourceRequested = true;</w:t>
-            </w:r>
-            <w:r>
-              <w:rPr>
-                <w:rFonts w:ascii="Consolas" w:hAnsi="Consolas"/>
-                <w:color w:val="1E293B"/>
-                <w:sz w:val="17"/>
-              </w:rPr>
-              <w:br/>
-              <w:t xml:space="preserve">                }</w:t>
-            </w:r>
-            <w:r>
-              <w:rPr>
-                <w:rFonts w:ascii="Consolas" w:hAnsi="Consolas"/>
-                <w:color w:val="1E293B"/>
-                <w:sz w:val="17"/>
-              </w:rPr>
-              <w:br/>
-            </w:r>
-            <w:r>
-              <w:rPr>
-                <w:rFonts w:ascii="Consolas" w:hAnsi="Consolas"/>
-                <w:color w:val="1E293B"/>
-                <w:sz w:val="17"/>
-              </w:rPr>
-              <w:br/>
-              <w:t xml:space="preserve">                if (hitTestSource) {</w:t>
-            </w:r>
-            <w:r>
-              <w:rPr>
-                <w:rFonts w:ascii="Consolas" w:hAnsi="Consolas"/>
-                <w:color w:val="1E293B"/>
-                <w:sz w:val="17"/>
-              </w:rPr>
-              <w:br/>
-              <w:t xml:space="preserve">                    const results = frame.getHitTestResults(hitTestSource);</w:t>
-            </w:r>
-            <w:r>
-              <w:rPr>
-                <w:rFonts w:ascii="Consolas" w:hAnsi="Consolas"/>
-                <w:color w:val="1E293B"/>
-                <w:sz w:val="17"/>
-              </w:rPr>
-              <w:br/>
-              <w:t xml:space="preserve">                    if (results.length &gt; 0) {</w:t>
-            </w:r>
-            <w:r>
-              <w:rPr>
-                <w:rFonts w:ascii="Consolas" w:hAnsi="Consolas"/>
-                <w:color w:val="1E293B"/>
-                <w:sz w:val="17"/>
-              </w:rPr>
-              <w:br/>
-            </w:r>
-            <w:r>
-              <w:rPr>
-                <w:rFonts w:ascii="Consolas" w:hAnsi="Consolas"/>
-                <w:color w:val="1E293B"/>
-                <w:sz w:val="17"/>
-              </w:rPr>
-              <w:lastRenderedPageBreak/>
-              <w:t xml:space="preserve">                        reticle.visible = true;</w:t>
-            </w:r>
-            <w:r>
-              <w:rPr>
-                <w:rFonts w:ascii="Consolas" w:hAnsi="Consolas"/>
-                <w:color w:val="1E293B"/>
-                <w:sz w:val="17"/>
-              </w:rPr>
-              <w:br/>
-              <w:t xml:space="preserve">                        reticle.matrix.fromArray(results[0].getPose(refSpace).transform.matrix);</w:t>
-            </w:r>
-            <w:r>
-              <w:rPr>
-                <w:rFonts w:ascii="Consolas" w:hAnsi="Consolas"/>
-                <w:color w:val="1E293B"/>
-                <w:sz w:val="17"/>
-              </w:rPr>
-              <w:br/>
-              <w:t xml:space="preserve">                    } else {</w:t>
-            </w:r>
-            <w:r>
-              <w:rPr>
-                <w:rFonts w:ascii="Consolas" w:hAnsi="Consolas"/>
-                <w:color w:val="1E293B"/>
-                <w:sz w:val="17"/>
-              </w:rPr>
-              <w:br/>
-              <w:t xml:space="preserve">                        reticle.visible = false;</w:t>
-            </w:r>
-            <w:r>
-              <w:rPr>
-                <w:rFonts w:ascii="Consolas" w:hAnsi="Consolas"/>
-                <w:color w:val="1E293B"/>
-                <w:sz w:val="17"/>
-              </w:rPr>
-              <w:br/>
-              <w:t xml:space="preserve">                    }</w:t>
-            </w:r>
-            <w:r>
-              <w:rPr>
-                <w:rFonts w:ascii="Consolas" w:hAnsi="Consolas"/>
-                <w:color w:val="1E293B"/>
-                <w:sz w:val="17"/>
-              </w:rPr>
-              <w:br/>
-              <w:t xml:space="preserve">                }</w:t>
-            </w:r>
-            <w:r>
-              <w:rPr>
-                <w:rFonts w:ascii="Consolas" w:hAnsi="Consolas"/>
-                <w:color w:val="1E293B"/>
-                <w:sz w:val="17"/>
-              </w:rPr>
-              <w:br/>
-              <w:t xml:space="preserve">            }</w:t>
-            </w:r>
-            <w:r>
-              <w:rPr>
-                <w:rFonts w:ascii="Consolas" w:hAnsi="Consolas"/>
-                <w:color w:val="1E293B"/>
-                <w:sz w:val="17"/>
-              </w:rPr>
-              <w:br/>
-              <w:t xml:space="preserve">            renderer.render(scene, camera);</w:t>
-            </w:r>
-            <w:r>
-              <w:rPr>
-                <w:rFonts w:ascii="Consolas" w:hAnsi="Consolas"/>
-                <w:color w:val="1E293B"/>
-                <w:sz w:val="17"/>
-              </w:rPr>
-              <w:br/>
-              <w:t xml:space="preserve">        }</w:t>
-            </w:r>
-            <w:r>
-              <w:rPr>
-                <w:rFonts w:ascii="Consolas" w:hAnsi="Consolas"/>
-                <w:color w:val="1E293B"/>
-                <w:sz w:val="17"/>
-              </w:rPr>
-              <w:br/>
-              <w:t xml:space="preserve">    &lt;/script&gt;</w:t>
-            </w:r>
-            <w:r>
-              <w:rPr>
-                <w:rFonts w:ascii="Consolas" w:hAnsi="Consolas"/>
-                <w:color w:val="1E293B"/>
-                <w:sz w:val="17"/>
-              </w:rPr>
-              <w:br/>
-              <w:t>&lt;/body&gt;</w:t>
-            </w:r>
-            <w:r>
-              <w:rPr>
-                <w:rFonts w:ascii="Consolas" w:hAnsi="Consolas"/>
-                <w:color w:val="1E293B"/>
-                <w:sz w:val="17"/>
-              </w:rPr>
-              <w:br/>
-              <w:t>&lt;/html&gt;</w:t>
-            </w:r>
-          </w:p>
-        </w:tc>
-      </w:tr>
-    </w:tbl>
-    <w:p/>
-    <w:p>
-      <w:pPr>
-        <w:spacing w:before="240"/>
-      </w:pPr>
-      <w:r>
-        <w:rPr>
-          <w:b/>
-        </w:rPr>
-        <w:t>Развертывание и тестирование:</w:t>
-      </w:r>
-    </w:p>
-    <w:p>
-      <w:pPr>
-        <w:rPr>
-          <w:lang w:val="ru-RU"/>
-        </w:rPr>
-      </w:pPr>
-      <w:r>
-        <w:rPr>
-          <w:lang w:val="ru-RU"/>
-        </w:rPr>
-        <w:t xml:space="preserve">Страница проверена на телефоне с поддержкой </w:t>
-      </w:r>
-      <w:proofErr w:type="spellStart"/>
-      <w:r>
-        <w:t>WebXR</w:t>
-      </w:r>
-      <w:proofErr w:type="spellEnd"/>
-      <w:r>
-        <w:rPr>
-          <w:lang w:val="ru-RU"/>
-        </w:rPr>
-        <w:t xml:space="preserve"> (</w:t>
-      </w:r>
-      <w:r>
-        <w:t>Google</w:t>
-      </w:r>
-      <w:r>
-        <w:rPr>
-          <w:lang w:val="ru-RU"/>
-        </w:rPr>
-        <w:t xml:space="preserve"> </w:t>
-      </w:r>
-      <w:r>
-        <w:t>Chrome</w:t>
-      </w:r>
-      <w:r>
-        <w:rPr>
-          <w:lang w:val="ru-RU"/>
-        </w:rPr>
-        <w:t xml:space="preserve"> на </w:t>
-      </w:r>
-      <w:r>
-        <w:t>Android</w:t>
-      </w:r>
-      <w:r>
-        <w:rPr>
-          <w:lang w:val="ru-RU"/>
-        </w:rPr>
-        <w:t xml:space="preserve"> с </w:t>
-      </w:r>
-      <w:proofErr w:type="spellStart"/>
-      <w:r>
-        <w:t>ARCore</w:t>
-      </w:r>
-      <w:proofErr w:type="spellEnd"/>
-      <w:r>
-        <w:rPr>
-          <w:lang w:val="ru-RU"/>
-        </w:rPr>
-        <w:t>). При сканировании пола кольцо четко скользит по поверхности, а при клике столик ставится на пол и остается неподвижным при ходьбе вокруг него.</w:t>
-      </w:r>
-    </w:p>
-    <w:p>
-      <w:pPr>
-        <w:rPr>
-          <w:lang w:val="ru-RU"/>
-        </w:rPr>
-      </w:pPr>
-    </w:p>
     <w:sectPr>
       <w:pgSz w:w="12240" w:h="15840"/>
       <w:pgMar w:top="1138" w:right="850" w:bottom="1138" w:left="1411" w:header="720" w:footer="720" w:gutter="0"/>
@@ -6513,6 +4008,7 @@
   <w:style w:type="character" w:default="1" w:styleId="a2">
     <w:name w:val="Default Paragraph Font"/>
     <w:uiPriority w:val="1"/>
+    <w:semiHidden/>
     <w:unhideWhenUsed/>
   </w:style>
   <w:style w:type="table" w:default="1" w:styleId="a3">

</xml_diff>

<commit_message>
Refactor Task 2 to match clean minimal pr2-webar example
</commit_message>
<xml_diff>
--- a/1-2_МамасоваАС_ИКБО-30_24.docx
+++ b/1-2_МамасоваАС_ИКБО-30_24.docx
@@ -275,7 +275,7 @@
                 </mc:Choice>
                 <mc:Fallback>
                   <w:pict>
-                    <v:line w14:anchorId="29D3C1B2" id="Прямая соединительная линия 6" o:spid="_x0000_s1026" style="flip:y;visibility:visible;mso-wrap-style:square;mso-left-percent:-10001;mso-top-percent:-10001;mso-position-horizontal:absolute;mso-position-horizontal-relative:char;mso-position-vertical:absolute;mso-position-vertical-relative:line;mso-left-percent:-10001;mso-top-percent:-10001" from="0,0" to="441pt,.1pt" o:gfxdata="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" strokeweight="3pt">
+                    <v:line w14:anchorId="5C9AC302" id="Прямая соединительная линия 6" o:spid="_x0000_s1026" style="flip:y;visibility:visible;mso-wrap-style:square;mso-left-percent:-10001;mso-top-percent:-10001;mso-position-horizontal:absolute;mso-position-horizontal-relative:char;mso-position-vertical:absolute;mso-position-vertical-relative:line;mso-left-percent:-10001;mso-top-percent:-10001" from="0,0" to="441pt,.1pt" o:gfxdata="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" strokeweight="3pt">
                       <v:stroke linestyle="thinThin"/>
                       <w10:anchorlock/>
                     </v:line>
@@ -296,59 +296,13 @@
           <w:sz w:val="22"/>
         </w:rPr>
       </w:pPr>
-      <w:proofErr w:type="spellStart"/>
       <w:r>
         <w:rPr>
           <w:rFonts w:eastAsia="MS Mincho" w:cs="Times New Roman"/>
           <w:b/>
           <w:sz w:val="22"/>
         </w:rPr>
-        <w:t>Институт</w:t>
-      </w:r>
-      <w:proofErr w:type="spellEnd"/>
-      <w:r>
-        <w:rPr>
-          <w:rFonts w:eastAsia="MS Mincho" w:cs="Times New Roman"/>
-          <w:b/>
-          <w:sz w:val="22"/>
-        </w:rPr>
-        <w:t xml:space="preserve"> </w:t>
-      </w:r>
-      <w:proofErr w:type="spellStart"/>
-      <w:r>
-        <w:rPr>
-          <w:rFonts w:eastAsia="MS Mincho" w:cs="Times New Roman"/>
-          <w:b/>
-          <w:sz w:val="22"/>
-        </w:rPr>
-        <w:t>информационных</w:t>
-      </w:r>
-      <w:proofErr w:type="spellEnd"/>
-      <w:r>
-        <w:rPr>
-          <w:rFonts w:eastAsia="MS Mincho" w:cs="Times New Roman"/>
-          <w:b/>
-          <w:sz w:val="22"/>
-        </w:rPr>
-        <w:t xml:space="preserve"> </w:t>
-      </w:r>
-      <w:proofErr w:type="spellStart"/>
-      <w:r>
-        <w:rPr>
-          <w:rFonts w:eastAsia="MS Mincho" w:cs="Times New Roman"/>
-          <w:b/>
-          <w:sz w:val="22"/>
-        </w:rPr>
-        <w:t>технологий</w:t>
-      </w:r>
-      <w:proofErr w:type="spellEnd"/>
-      <w:r>
-        <w:rPr>
-          <w:rFonts w:eastAsia="MS Mincho" w:cs="Times New Roman"/>
-          <w:b/>
-          <w:sz w:val="22"/>
-        </w:rPr>
-        <w:t xml:space="preserve"> (ИИТ)</w:t>
+        <w:t>Институт информационных технологий (ИИТ)</w:t>
       </w:r>
     </w:p>
     <w:p>
@@ -601,31 +555,7 @@
                 <w:szCs w:val="24"/>
                 <w:lang w:val="ru-RU"/>
               </w:rPr>
-              <w:t xml:space="preserve">ИКБО-30-24, </w:t>
-            </w:r>
-            <w:proofErr w:type="spellStart"/>
-            <w:r>
-              <w:rPr>
-                <w:rFonts w:eastAsia="Calibri"/>
-                <w:i/>
-                <w:iCs/>
-                <w:color w:val="auto"/>
-                <w:szCs w:val="24"/>
-                <w:lang w:val="ru-RU"/>
-              </w:rPr>
-              <w:t>Мамасова</w:t>
-            </w:r>
-            <w:proofErr w:type="spellEnd"/>
-            <w:r>
-              <w:rPr>
-                <w:rFonts w:eastAsia="Calibri"/>
-                <w:i/>
-                <w:iCs/>
-                <w:color w:val="auto"/>
-                <w:szCs w:val="24"/>
-                <w:lang w:val="ru-RU"/>
-              </w:rPr>
-              <w:t xml:space="preserve"> Анна Сергеевна</w:t>
+              <w:t>ИКБО-30-24, Мамасова Анна Сергеевна</w:t>
             </w:r>
           </w:p>
         </w:tc>
@@ -683,7 +613,6 @@
                 <w:lang w:val="ru-RU"/>
               </w:rPr>
             </w:pPr>
-            <w:proofErr w:type="spellStart"/>
             <w:r>
               <w:rPr>
                 <w:rFonts w:ascii="Calibri" w:eastAsia="Calibri" w:hAnsi="Calibri"/>
@@ -693,19 +622,7 @@
                 <w:sz w:val="22"/>
                 <w:lang w:val="ru-RU"/>
               </w:rPr>
-              <w:t>Колодочкин</w:t>
-            </w:r>
-            <w:proofErr w:type="spellEnd"/>
-            <w:r>
-              <w:rPr>
-                <w:rFonts w:ascii="Calibri" w:eastAsia="Calibri" w:hAnsi="Calibri"/>
-                <w:i/>
-                <w:iCs/>
-                <w:color w:val="auto"/>
-                <w:sz w:val="22"/>
-                <w:lang w:val="ru-RU"/>
-              </w:rPr>
-              <w:t xml:space="preserve"> Алексей Александрович</w:t>
+              <w:t>Колодочкин Алексей Александрович</w:t>
             </w:r>
           </w:p>
           <w:p>
@@ -809,19 +726,11 @@
           <w:rFonts w:eastAsia="MS Mincho" w:cs="Times New Roman"/>
         </w:rPr>
       </w:pPr>
-      <w:proofErr w:type="spellStart"/>
       <w:r>
         <w:rPr>
           <w:rFonts w:eastAsia="MS Mincho" w:cs="Times New Roman"/>
         </w:rPr>
-        <w:t>Москва</w:t>
-      </w:r>
-      <w:proofErr w:type="spellEnd"/>
-      <w:r>
-        <w:rPr>
-          <w:rFonts w:eastAsia="MS Mincho" w:cs="Times New Roman"/>
-        </w:rPr>
-        <w:t xml:space="preserve"> 2026 г.</w:t>
+        <w:t>Москва 2026 г.</w:t>
       </w:r>
     </w:p>
     <w:p>
@@ -851,14 +760,12 @@
         </w:rPr>
         <w:t xml:space="preserve">Тема: Реализация базового </w:t>
       </w:r>
-      <w:proofErr w:type="spellStart"/>
       <w:r>
         <w:rPr>
           <w:b/>
         </w:rPr>
         <w:t>WebAR</w:t>
       </w:r>
-      <w:proofErr w:type="spellEnd"/>
       <w:r>
         <w:rPr>
           <w:b/>
@@ -897,19 +804,11 @@
       <w:pPr>
         <w:spacing w:before="240"/>
       </w:pPr>
-      <w:proofErr w:type="spellStart"/>
       <w:r>
         <w:rPr>
           <w:b/>
         </w:rPr>
-        <w:t>Требования</w:t>
-      </w:r>
-      <w:proofErr w:type="spellEnd"/>
-      <w:r>
-        <w:rPr>
-          <w:b/>
-        </w:rPr>
-        <w:t>:</w:t>
+        <w:t>Требования:</w:t>
       </w:r>
     </w:p>
     <w:p>
@@ -992,22 +891,18 @@
         </w:rPr>
         <w:t xml:space="preserve"> (</w:t>
       </w:r>
-      <w:proofErr w:type="spellStart"/>
       <w:r>
         <w:t>ar</w:t>
       </w:r>
-      <w:proofErr w:type="spellEnd"/>
       <w:r>
         <w:rPr>
           <w:lang w:val="ru-RU"/>
         </w:rPr>
         <w:t xml:space="preserve">, </w:t>
       </w:r>
-      <w:proofErr w:type="spellStart"/>
       <w:r>
         <w:t>ar</w:t>
       </w:r>
-      <w:proofErr w:type="spellEnd"/>
       <w:r>
         <w:rPr>
           <w:lang w:val="ru-RU"/>
@@ -1028,21 +923,8 @@
       <w:pPr>
         <w:pStyle w:val="a0"/>
       </w:pPr>
-      <w:proofErr w:type="spellStart"/>
-      <w:r>
-        <w:t>Настроить</w:t>
-      </w:r>
-      <w:proofErr w:type="spellEnd"/>
-      <w:r>
-        <w:t xml:space="preserve"> </w:t>
-      </w:r>
-      <w:proofErr w:type="spellStart"/>
-      <w:r>
-        <w:t>поддержку</w:t>
-      </w:r>
-      <w:proofErr w:type="spellEnd"/>
-      <w:r>
-        <w:t xml:space="preserve"> Quick Look (iOS) и Scene Viewer (Android).</w:t>
+      <w:r>
+        <w:t>Настроить поддержку Quick Look (iOS) и Scene Viewer (Android).</w:t>
       </w:r>
     </w:p>
     <w:p>
@@ -1058,11 +940,9 @@
         </w:rPr>
         <w:t xml:space="preserve">Подготовить модель в форматах </w:t>
       </w:r>
-      <w:proofErr w:type="spellStart"/>
       <w:r>
         <w:t>glTF</w:t>
       </w:r>
-      <w:proofErr w:type="spellEnd"/>
       <w:r>
         <w:rPr>
           <w:lang w:val="ru-RU"/>
@@ -1176,22 +1056,18 @@
         </w:rPr>
         <w:t>.</w:t>
       </w:r>
-      <w:proofErr w:type="spellStart"/>
       <w:r>
         <w:t>glb</w:t>
       </w:r>
-      <w:proofErr w:type="spellEnd"/>
       <w:r>
         <w:rPr>
           <w:lang w:val="ru-RU"/>
         </w:rPr>
         <w:t xml:space="preserve">) в формате </w:t>
       </w:r>
-      <w:proofErr w:type="spellStart"/>
       <w:r>
         <w:t>glTF</w:t>
       </w:r>
-      <w:proofErr w:type="spellEnd"/>
       <w:r>
         <w:rPr>
           <w:lang w:val="ru-RU"/>
@@ -1205,28 +1081,17 @@
         <w:rPr>
           <w:lang w:val="ru-RU"/>
         </w:rPr>
-        <w:t xml:space="preserve">, ее также сконвертировали в </w:t>
-      </w:r>
-      <w:proofErr w:type="gramStart"/>
-      <w:r>
-        <w:rPr>
-          <w:lang w:val="ru-RU"/>
-        </w:rPr>
-        <w:t>формат .</w:t>
-      </w:r>
-      <w:proofErr w:type="spellStart"/>
+        <w:t>, ее также сконвертировали в формат .</w:t>
+      </w:r>
       <w:r>
         <w:t>usdz</w:t>
       </w:r>
-      <w:proofErr w:type="spellEnd"/>
-      <w:proofErr w:type="gramEnd"/>
       <w:r>
         <w:rPr>
           <w:lang w:val="ru-RU"/>
         </w:rPr>
         <w:t xml:space="preserve"> (</w:t>
       </w:r>
-      <w:proofErr w:type="gramStart"/>
       <w:r>
         <w:t>dish</w:t>
       </w:r>
@@ -1236,12 +1101,9 @@
         </w:rPr>
         <w:t>.</w:t>
       </w:r>
-      <w:proofErr w:type="spellStart"/>
       <w:r>
         <w:t>usdz</w:t>
       </w:r>
-      <w:proofErr w:type="spellEnd"/>
-      <w:proofErr w:type="gramEnd"/>
       <w:r>
         <w:rPr>
           <w:lang w:val="ru-RU"/>
@@ -1503,11 +1365,9 @@
         </w:rPr>
         <w:t>.</w:t>
       </w:r>
-      <w:proofErr w:type="spellStart"/>
       <w:r>
         <w:t>hdr</w:t>
       </w:r>
-      <w:proofErr w:type="spellEnd"/>
       <w:r>
         <w:rPr>
           <w:lang w:val="ru-RU"/>
@@ -1575,14 +1435,12 @@
         </w:rPr>
         <w:t>="</w:t>
       </w:r>
-      <w:proofErr w:type="spellStart"/>
       <w:r>
         <w:rPr>
           <w:b/>
         </w:rPr>
         <w:t>ar</w:t>
       </w:r>
-      <w:proofErr w:type="spellEnd"/>
       <w:r>
         <w:rPr>
           <w:b/>
@@ -1614,33 +1472,11 @@
       <w:pPr>
         <w:spacing w:before="240"/>
       </w:pPr>
-      <w:proofErr w:type="spellStart"/>
       <w:r>
         <w:rPr>
           <w:b/>
         </w:rPr>
-        <w:t>Листинг</w:t>
-      </w:r>
-      <w:proofErr w:type="spellEnd"/>
-      <w:r>
-        <w:rPr>
-          <w:b/>
-        </w:rPr>
-        <w:t xml:space="preserve"> </w:t>
-      </w:r>
-      <w:proofErr w:type="spellStart"/>
-      <w:r>
-        <w:rPr>
-          <w:b/>
-        </w:rPr>
-        <w:t>кода</w:t>
-      </w:r>
-      <w:proofErr w:type="spellEnd"/>
-      <w:r>
-        <w:rPr>
-          <w:b/>
-        </w:rPr>
-        <w:t xml:space="preserve"> index.html:</w:t>
+        <w:t>Листинг кода index.html:</w:t>
       </w:r>
     </w:p>
     <w:tbl>
@@ -1998,11 +1834,9 @@
         </w:rPr>
         <w:t>.</w:t>
       </w:r>
-      <w:proofErr w:type="spellStart"/>
       <w:r>
         <w:t>py</w:t>
       </w:r>
-      <w:proofErr w:type="spellEnd"/>
       <w:r>
         <w:rPr>
           <w:lang w:val="ru-RU"/>
@@ -2030,6 +1864,7 @@
     </w:p>
     <w:p>
       <w:pPr>
+        <w:jc w:val="center"/>
         <w:rPr>
           <w:lang w:val="ru-RU"/>
         </w:rPr>
@@ -2038,11 +1873,12 @@
         <w:rPr>
           <w:noProof/>
         </w:rPr>
+        <w:lastRenderedPageBreak/>
         <w:drawing>
-          <wp:inline distT="0" distB="0" distL="0" distR="0" wp14:anchorId="5799081E" wp14:editId="3AA631A1">
-            <wp:extent cx="6336665" cy="3797300"/>
-            <wp:effectExtent l="0" t="0" r="6985" b="0"/>
-            <wp:docPr id="506983744" name="Рисунок 2"/>
+          <wp:inline distT="0" distB="0" distL="0" distR="0" wp14:anchorId="51968C9C" wp14:editId="16897985">
+            <wp:extent cx="3078480" cy="6678903"/>
+            <wp:effectExtent l="0" t="0" r="7620" b="8255"/>
+            <wp:docPr id="615841100" name="Рисунок 1"/>
             <wp:cNvGraphicFramePr>
               <a:graphicFrameLocks xmlns:a="http://schemas.openxmlformats.org/drawingml/2006/main" noChangeAspect="1"/>
             </wp:cNvGraphicFramePr>
@@ -2050,7 +1886,7 @@
               <a:graphicData uri="http://schemas.openxmlformats.org/drawingml/2006/picture">
                 <pic:pic xmlns:pic="http://schemas.openxmlformats.org/drawingml/2006/picture">
                   <pic:nvPicPr>
-                    <pic:cNvPr id="506983744" name="Рисунок 506983744"/>
+                    <pic:cNvPr id="615841100" name=""/>
                     <pic:cNvPicPr/>
                   </pic:nvPicPr>
                   <pic:blipFill>
@@ -2062,7 +1898,7 @@
                   <pic:spPr>
                     <a:xfrm>
                       <a:off x="0" y="0"/>
-                      <a:ext cx="6336665" cy="3797300"/>
+                      <a:ext cx="3080567" cy="6683431"/>
                     </a:xfrm>
                     <a:prstGeom prst="rect">
                       <a:avLst/>
@@ -2117,19 +1953,11 @@
         </w:rPr>
         <w:t xml:space="preserve">Тема: Внедрение трекинга изображений с помощью </w:t>
       </w:r>
-      <w:proofErr w:type="spellStart"/>
       <w:r>
         <w:rPr>
           <w:b/>
         </w:rPr>
-        <w:t>MindAR</w:t>
-      </w:r>
-      <w:proofErr w:type="spellEnd"/>
-      <w:r>
-        <w:rPr>
-          <w:b/>
-        </w:rPr>
-        <w:t xml:space="preserve"> (A-Frame)</w:t>
+        <w:t>MindAR (A-Frame)</w:t>
       </w:r>
     </w:p>
     <w:p>
@@ -2183,11 +2011,9 @@
         </w:rPr>
         <w:t xml:space="preserve"> и </w:t>
       </w:r>
-      <w:proofErr w:type="spellStart"/>
       <w:r>
         <w:t>MindAR</w:t>
       </w:r>
-      <w:proofErr w:type="spellEnd"/>
       <w:r>
         <w:rPr>
           <w:lang w:val="ru-RU"/>
@@ -2208,7 +2034,6 @@
         </w:rPr>
         <w:t xml:space="preserve">Подготовить изображение-маркер и скомпилировать его в формат </w:t>
       </w:r>
-      <w:proofErr w:type="gramStart"/>
       <w:r>
         <w:t>targets</w:t>
       </w:r>
@@ -2221,18 +2046,15 @@
       <w:r>
         <w:t>mind</w:t>
       </w:r>
-      <w:proofErr w:type="gramEnd"/>
       <w:r>
         <w:rPr>
           <w:lang w:val="ru-RU"/>
         </w:rPr>
         <w:t xml:space="preserve"> с помощью утилиты </w:t>
       </w:r>
-      <w:proofErr w:type="spellStart"/>
       <w:r>
         <w:t>MindAR</w:t>
       </w:r>
-      <w:proofErr w:type="spellEnd"/>
       <w:r>
         <w:rPr>
           <w:lang w:val="ru-RU"/>
@@ -2294,11 +2116,9 @@
         </w:rPr>
         <w:t xml:space="preserve">-модель (в формате </w:t>
       </w:r>
-      <w:proofErr w:type="spellStart"/>
       <w:r>
         <w:t>glTF</w:t>
       </w:r>
-      <w:proofErr w:type="spellEnd"/>
       <w:r>
         <w:rPr>
           <w:lang w:val="ru-RU"/>
@@ -2376,29 +2196,24 @@
         </w:rPr>
         <w:t>.</w:t>
       </w:r>
-      <w:proofErr w:type="spellStart"/>
       <w:r>
         <w:t>png</w:t>
       </w:r>
-      <w:proofErr w:type="spellEnd"/>
       <w:r>
         <w:rPr>
           <w:lang w:val="ru-RU"/>
         </w:rPr>
         <w:t xml:space="preserve">) с контрастными деталями. С помощью онлайн компилятора </w:t>
       </w:r>
-      <w:proofErr w:type="spellStart"/>
       <w:r>
         <w:t>MindAR</w:t>
       </w:r>
-      <w:proofErr w:type="spellEnd"/>
       <w:r>
         <w:rPr>
           <w:lang w:val="ru-RU"/>
         </w:rPr>
         <w:t xml:space="preserve"> оно было скомпилировано в файл </w:t>
       </w:r>
-      <w:proofErr w:type="gramStart"/>
       <w:r>
         <w:t>targets</w:t>
       </w:r>
@@ -2411,7 +2226,6 @@
       <w:r>
         <w:t>mind</w:t>
       </w:r>
-      <w:proofErr w:type="gramEnd"/>
       <w:r>
         <w:rPr>
           <w:lang w:val="ru-RU"/>
@@ -2427,11 +2241,9 @@
         </w:rPr>
         <w:t>.</w:t>
       </w:r>
-      <w:proofErr w:type="spellStart"/>
       <w:r>
         <w:t>glb</w:t>
       </w:r>
-      <w:proofErr w:type="spellEnd"/>
       <w:r>
         <w:rPr>
           <w:lang w:val="ru-RU"/>
@@ -2507,11 +2319,9 @@
         </w:rPr>
         <w:t xml:space="preserve"> 1.4.2 и </w:t>
       </w:r>
-      <w:proofErr w:type="spellStart"/>
       <w:r>
         <w:t>MindAR</w:t>
       </w:r>
-      <w:proofErr w:type="spellEnd"/>
       <w:r>
         <w:rPr>
           <w:lang w:val="ru-RU"/>
@@ -2536,7 +2346,6 @@
         </w:rPr>
         <w:t xml:space="preserve">&gt; указан файл </w:t>
       </w:r>
-      <w:proofErr w:type="gramStart"/>
       <w:r>
         <w:t>targets</w:t>
       </w:r>
@@ -2549,7 +2358,6 @@
       <w:r>
         <w:t>mind</w:t>
       </w:r>
-      <w:proofErr w:type="gramEnd"/>
       <w:r>
         <w:rPr>
           <w:lang w:val="ru-RU"/>

</xml_diff>